<commit_message>
Capitulos unidos updated with table index complete
</commit_message>
<xml_diff>
--- a/docs/Capitulos unidos.docx
+++ b/docs/Capitulos unidos.docx
@@ -2508,7 +2508,31 @@
           <w:sz w:val="24"/>
           <w:szCs w:val="24"/>
         </w:rPr>
-        <w:t>Tabla 1.1 xxxx</w:t>
+        <w:t xml:space="preserve">Tabla </w:t>
+      </w:r>
+      <w:r>
+        <w:rPr>
+          <w:rFonts w:ascii="Times New Roman" w:eastAsia="Times New Roman" w:hAnsi="Times New Roman" w:cs="Times New Roman"/>
+          <w:sz w:val="24"/>
+          <w:szCs w:val="24"/>
+        </w:rPr>
+        <w:t>2</w:t>
+      </w:r>
+      <w:r>
+        <w:rPr>
+          <w:rFonts w:ascii="Times New Roman" w:eastAsia="Times New Roman" w:hAnsi="Times New Roman" w:cs="Times New Roman"/>
+          <w:sz w:val="24"/>
+          <w:szCs w:val="24"/>
+        </w:rPr>
+        <w:t xml:space="preserve">.1 </w:t>
+      </w:r>
+      <w:r>
+        <w:rPr>
+          <w:rFonts w:ascii="Times New Roman" w:eastAsia="Times New Roman" w:hAnsi="Times New Roman" w:cs="Times New Roman"/>
+          <w:sz w:val="24"/>
+          <w:szCs w:val="24"/>
+        </w:rPr>
+        <w:t>Tabla comparativa de herramientas del mercado</w:t>
       </w:r>
       <w:r>
         <w:rPr>
@@ -2517,7 +2541,14 @@
           <w:szCs w:val="24"/>
         </w:rPr>
         <w:tab/>
-        <w:t>x</w:t>
+      </w:r>
+      <w:r>
+        <w:rPr>
+          <w:rFonts w:ascii="Times New Roman" w:eastAsia="Times New Roman" w:hAnsi="Times New Roman" w:cs="Times New Roman"/>
+          <w:sz w:val="24"/>
+          <w:szCs w:val="24"/>
+        </w:rPr>
+        <w:t>22</w:t>
       </w:r>
     </w:p>
     <w:p>
@@ -2532,13 +2563,66 @@
           <w:szCs w:val="24"/>
         </w:rPr>
       </w:pPr>
-      <w:r>
-        <w:rPr>
-          <w:rFonts w:ascii="Times New Roman" w:eastAsia="Times New Roman" w:hAnsi="Times New Roman" w:cs="Times New Roman"/>
-          <w:sz w:val="24"/>
-          <w:szCs w:val="24"/>
-        </w:rPr>
-        <w:t>Tabla 1.2 xxxx</w:t>
+    </w:p>
+    <w:p>
+      <w:pPr>
+        <w:tabs>
+          <w:tab w:val="right" w:pos="8775"/>
+        </w:tabs>
+        <w:jc w:val="both"/>
+        <w:rPr>
+          <w:rFonts w:ascii="Times New Roman" w:eastAsia="Times New Roman" w:hAnsi="Times New Roman" w:cs="Times New Roman"/>
+          <w:sz w:val="24"/>
+          <w:szCs w:val="24"/>
+        </w:rPr>
+      </w:pPr>
+      <w:r>
+        <w:rPr>
+          <w:rFonts w:ascii="Times New Roman" w:eastAsia="Times New Roman" w:hAnsi="Times New Roman" w:cs="Times New Roman"/>
+          <w:sz w:val="24"/>
+          <w:szCs w:val="24"/>
+        </w:rPr>
+        <w:t xml:space="preserve">Tabla </w:t>
+      </w:r>
+      <w:r>
+        <w:rPr>
+          <w:rFonts w:ascii="Times New Roman" w:eastAsia="Times New Roman" w:hAnsi="Times New Roman" w:cs="Times New Roman"/>
+          <w:sz w:val="24"/>
+          <w:szCs w:val="24"/>
+        </w:rPr>
+        <w:t>4</w:t>
+      </w:r>
+      <w:r>
+        <w:rPr>
+          <w:rFonts w:ascii="Times New Roman" w:eastAsia="Times New Roman" w:hAnsi="Times New Roman" w:cs="Times New Roman"/>
+          <w:sz w:val="24"/>
+          <w:szCs w:val="24"/>
+        </w:rPr>
+        <w:t>.</w:t>
+      </w:r>
+      <w:r>
+        <w:rPr>
+          <w:rFonts w:ascii="Times New Roman" w:eastAsia="Times New Roman" w:hAnsi="Times New Roman" w:cs="Times New Roman"/>
+          <w:sz w:val="24"/>
+          <w:szCs w:val="24"/>
+        </w:rPr>
+        <w:t>1</w:t>
+      </w:r>
+      <w:r>
+        <w:rPr>
+          <w:rFonts w:ascii="Times New Roman" w:eastAsia="Times New Roman" w:hAnsi="Times New Roman" w:cs="Times New Roman"/>
+          <w:sz w:val="24"/>
+          <w:szCs w:val="24"/>
+        </w:rPr>
+        <w:t xml:space="preserve"> </w:t>
+      </w:r>
+      <w:r>
+        <w:rPr>
+          <w:rFonts w:ascii="Times New Roman" w:eastAsia="Times New Roman" w:hAnsi="Times New Roman" w:cs="Times New Roman"/>
+          <w:sz w:val="24"/>
+          <w:szCs w:val="24"/>
+        </w:rPr>
+        <w:t>Actores del sistema CarePet</w:t>
       </w:r>
       <w:r>
         <w:rPr>
@@ -2547,7 +2631,460 @@
           <w:szCs w:val="24"/>
         </w:rPr>
         <w:tab/>
-        <w:t>x</w:t>
+      </w:r>
+      <w:r>
+        <w:rPr>
+          <w:rFonts w:ascii="Times New Roman" w:eastAsia="Times New Roman" w:hAnsi="Times New Roman" w:cs="Times New Roman"/>
+          <w:sz w:val="24"/>
+          <w:szCs w:val="24"/>
+        </w:rPr>
+        <w:t>36 - 37</w:t>
+      </w:r>
+    </w:p>
+    <w:p>
+      <w:pPr>
+        <w:tabs>
+          <w:tab w:val="right" w:pos="8775"/>
+        </w:tabs>
+        <w:jc w:val="both"/>
+        <w:rPr>
+          <w:rFonts w:ascii="Times New Roman" w:eastAsia="Times New Roman" w:hAnsi="Times New Roman" w:cs="Times New Roman"/>
+          <w:sz w:val="24"/>
+          <w:szCs w:val="24"/>
+        </w:rPr>
+      </w:pPr>
+      <w:r>
+        <w:rPr>
+          <w:rFonts w:ascii="Times New Roman" w:eastAsia="Times New Roman" w:hAnsi="Times New Roman" w:cs="Times New Roman"/>
+          <w:sz w:val="24"/>
+          <w:szCs w:val="24"/>
+        </w:rPr>
+        <w:t xml:space="preserve">Tabla </w:t>
+      </w:r>
+      <w:r>
+        <w:rPr>
+          <w:rFonts w:ascii="Times New Roman" w:eastAsia="Times New Roman" w:hAnsi="Times New Roman" w:cs="Times New Roman"/>
+          <w:sz w:val="24"/>
+          <w:szCs w:val="24"/>
+        </w:rPr>
+        <w:t>4</w:t>
+      </w:r>
+      <w:r>
+        <w:rPr>
+          <w:rFonts w:ascii="Times New Roman" w:eastAsia="Times New Roman" w:hAnsi="Times New Roman" w:cs="Times New Roman"/>
+          <w:sz w:val="24"/>
+          <w:szCs w:val="24"/>
+        </w:rPr>
+        <w:t xml:space="preserve">.2 </w:t>
+      </w:r>
+      <w:r>
+        <w:rPr>
+          <w:rFonts w:ascii="Times New Roman" w:eastAsia="Times New Roman" w:hAnsi="Times New Roman" w:cs="Times New Roman"/>
+          <w:sz w:val="24"/>
+          <w:szCs w:val="24"/>
+        </w:rPr>
+        <w:t>Requisitos funcionales</w:t>
+      </w:r>
+      <w:r>
+        <w:rPr>
+          <w:rFonts w:ascii="Times New Roman" w:eastAsia="Times New Roman" w:hAnsi="Times New Roman" w:cs="Times New Roman"/>
+          <w:sz w:val="24"/>
+          <w:szCs w:val="24"/>
+        </w:rPr>
+        <w:tab/>
+      </w:r>
+      <w:r>
+        <w:rPr>
+          <w:rFonts w:ascii="Times New Roman" w:eastAsia="Times New Roman" w:hAnsi="Times New Roman" w:cs="Times New Roman"/>
+          <w:sz w:val="24"/>
+          <w:szCs w:val="24"/>
+        </w:rPr>
+        <w:t>37 - 41</w:t>
+      </w:r>
+    </w:p>
+    <w:p>
+      <w:pPr>
+        <w:tabs>
+          <w:tab w:val="right" w:pos="8775"/>
+        </w:tabs>
+        <w:jc w:val="both"/>
+        <w:rPr>
+          <w:rFonts w:ascii="Times New Roman" w:eastAsia="Times New Roman" w:hAnsi="Times New Roman" w:cs="Times New Roman"/>
+          <w:sz w:val="24"/>
+          <w:szCs w:val="24"/>
+        </w:rPr>
+      </w:pPr>
+      <w:r>
+        <w:rPr>
+          <w:rFonts w:ascii="Times New Roman" w:eastAsia="Times New Roman" w:hAnsi="Times New Roman" w:cs="Times New Roman"/>
+          <w:sz w:val="24"/>
+          <w:szCs w:val="24"/>
+        </w:rPr>
+        <w:t xml:space="preserve">Tabla </w:t>
+      </w:r>
+      <w:r>
+        <w:rPr>
+          <w:rFonts w:ascii="Times New Roman" w:eastAsia="Times New Roman" w:hAnsi="Times New Roman" w:cs="Times New Roman"/>
+          <w:sz w:val="24"/>
+          <w:szCs w:val="24"/>
+        </w:rPr>
+        <w:t>4</w:t>
+      </w:r>
+      <w:r>
+        <w:rPr>
+          <w:rFonts w:ascii="Times New Roman" w:eastAsia="Times New Roman" w:hAnsi="Times New Roman" w:cs="Times New Roman"/>
+          <w:sz w:val="24"/>
+          <w:szCs w:val="24"/>
+        </w:rPr>
+        <w:t>.</w:t>
+      </w:r>
+      <w:r>
+        <w:rPr>
+          <w:rFonts w:ascii="Times New Roman" w:eastAsia="Times New Roman" w:hAnsi="Times New Roman" w:cs="Times New Roman"/>
+          <w:sz w:val="24"/>
+          <w:szCs w:val="24"/>
+        </w:rPr>
+        <w:t>3</w:t>
+      </w:r>
+      <w:r>
+        <w:rPr>
+          <w:rFonts w:ascii="Times New Roman" w:eastAsia="Times New Roman" w:hAnsi="Times New Roman" w:cs="Times New Roman"/>
+          <w:sz w:val="24"/>
+          <w:szCs w:val="24"/>
+        </w:rPr>
+        <w:t xml:space="preserve"> </w:t>
+      </w:r>
+      <w:r>
+        <w:rPr>
+          <w:rFonts w:ascii="Times New Roman" w:eastAsia="Times New Roman" w:hAnsi="Times New Roman" w:cs="Times New Roman"/>
+          <w:sz w:val="24"/>
+          <w:szCs w:val="24"/>
+        </w:rPr>
+        <w:t>Requisitos no funcionales</w:t>
+      </w:r>
+      <w:r>
+        <w:rPr>
+          <w:rFonts w:ascii="Times New Roman" w:eastAsia="Times New Roman" w:hAnsi="Times New Roman" w:cs="Times New Roman"/>
+          <w:sz w:val="24"/>
+          <w:szCs w:val="24"/>
+        </w:rPr>
+        <w:tab/>
+      </w:r>
+      <w:r>
+        <w:rPr>
+          <w:rFonts w:ascii="Times New Roman" w:eastAsia="Times New Roman" w:hAnsi="Times New Roman" w:cs="Times New Roman"/>
+          <w:sz w:val="24"/>
+          <w:szCs w:val="24"/>
+        </w:rPr>
+        <w:t>41</w:t>
+      </w:r>
+    </w:p>
+    <w:p>
+      <w:pPr>
+        <w:tabs>
+          <w:tab w:val="right" w:pos="8775"/>
+        </w:tabs>
+        <w:jc w:val="both"/>
+        <w:rPr>
+          <w:rFonts w:ascii="Times New Roman" w:eastAsia="Times New Roman" w:hAnsi="Times New Roman" w:cs="Times New Roman"/>
+          <w:sz w:val="24"/>
+          <w:szCs w:val="24"/>
+        </w:rPr>
+      </w:pPr>
+      <w:r>
+        <w:rPr>
+          <w:rFonts w:ascii="Times New Roman" w:eastAsia="Times New Roman" w:hAnsi="Times New Roman" w:cs="Times New Roman"/>
+          <w:sz w:val="24"/>
+          <w:szCs w:val="24"/>
+        </w:rPr>
+        <w:t xml:space="preserve">Tabla </w:t>
+      </w:r>
+      <w:r>
+        <w:rPr>
+          <w:rFonts w:ascii="Times New Roman" w:eastAsia="Times New Roman" w:hAnsi="Times New Roman" w:cs="Times New Roman"/>
+          <w:sz w:val="24"/>
+          <w:szCs w:val="24"/>
+        </w:rPr>
+        <w:t>4</w:t>
+      </w:r>
+      <w:r>
+        <w:rPr>
+          <w:rFonts w:ascii="Times New Roman" w:eastAsia="Times New Roman" w:hAnsi="Times New Roman" w:cs="Times New Roman"/>
+          <w:sz w:val="24"/>
+          <w:szCs w:val="24"/>
+        </w:rPr>
+        <w:t>.</w:t>
+      </w:r>
+      <w:r>
+        <w:rPr>
+          <w:rFonts w:ascii="Times New Roman" w:eastAsia="Times New Roman" w:hAnsi="Times New Roman" w:cs="Times New Roman"/>
+          <w:sz w:val="24"/>
+          <w:szCs w:val="24"/>
+        </w:rPr>
+        <w:t>4</w:t>
+      </w:r>
+      <w:r>
+        <w:rPr>
+          <w:rFonts w:ascii="Times New Roman" w:eastAsia="Times New Roman" w:hAnsi="Times New Roman" w:cs="Times New Roman"/>
+          <w:sz w:val="24"/>
+          <w:szCs w:val="24"/>
+        </w:rPr>
+        <w:t xml:space="preserve"> </w:t>
+      </w:r>
+      <w:r>
+        <w:rPr>
+          <w:rFonts w:ascii="Times New Roman" w:eastAsia="Times New Roman" w:hAnsi="Times New Roman" w:cs="Times New Roman"/>
+          <w:sz w:val="24"/>
+          <w:szCs w:val="24"/>
+        </w:rPr>
+        <w:t>Caso de uso CU-001: Registro de usuario</w:t>
+      </w:r>
+      <w:r>
+        <w:rPr>
+          <w:rFonts w:ascii="Times New Roman" w:eastAsia="Times New Roman" w:hAnsi="Times New Roman" w:cs="Times New Roman"/>
+          <w:sz w:val="24"/>
+          <w:szCs w:val="24"/>
+        </w:rPr>
+        <w:tab/>
+      </w:r>
+      <w:r>
+        <w:rPr>
+          <w:rFonts w:ascii="Times New Roman" w:eastAsia="Times New Roman" w:hAnsi="Times New Roman" w:cs="Times New Roman"/>
+          <w:sz w:val="24"/>
+          <w:szCs w:val="24"/>
+        </w:rPr>
+        <w:t>42</w:t>
+      </w:r>
+    </w:p>
+    <w:p>
+      <w:pPr>
+        <w:tabs>
+          <w:tab w:val="right" w:pos="8775"/>
+        </w:tabs>
+        <w:jc w:val="both"/>
+        <w:rPr>
+          <w:rFonts w:ascii="Times New Roman" w:eastAsia="Times New Roman" w:hAnsi="Times New Roman" w:cs="Times New Roman"/>
+          <w:sz w:val="24"/>
+          <w:szCs w:val="24"/>
+        </w:rPr>
+      </w:pPr>
+      <w:r>
+        <w:rPr>
+          <w:rFonts w:ascii="Times New Roman" w:eastAsia="Times New Roman" w:hAnsi="Times New Roman" w:cs="Times New Roman"/>
+          <w:sz w:val="24"/>
+          <w:szCs w:val="24"/>
+        </w:rPr>
+        <w:t xml:space="preserve">Tabla </w:t>
+      </w:r>
+      <w:r>
+        <w:rPr>
+          <w:rFonts w:ascii="Times New Roman" w:eastAsia="Times New Roman" w:hAnsi="Times New Roman" w:cs="Times New Roman"/>
+          <w:sz w:val="24"/>
+          <w:szCs w:val="24"/>
+        </w:rPr>
+        <w:t>4</w:t>
+      </w:r>
+      <w:r>
+        <w:rPr>
+          <w:rFonts w:ascii="Times New Roman" w:eastAsia="Times New Roman" w:hAnsi="Times New Roman" w:cs="Times New Roman"/>
+          <w:sz w:val="24"/>
+          <w:szCs w:val="24"/>
+        </w:rPr>
+        <w:t>.</w:t>
+      </w:r>
+      <w:r>
+        <w:rPr>
+          <w:rFonts w:ascii="Times New Roman" w:eastAsia="Times New Roman" w:hAnsi="Times New Roman" w:cs="Times New Roman"/>
+          <w:sz w:val="24"/>
+          <w:szCs w:val="24"/>
+        </w:rPr>
+        <w:t>5</w:t>
+      </w:r>
+      <w:r>
+        <w:rPr>
+          <w:rFonts w:ascii="Times New Roman" w:eastAsia="Times New Roman" w:hAnsi="Times New Roman" w:cs="Times New Roman"/>
+          <w:sz w:val="24"/>
+          <w:szCs w:val="24"/>
+        </w:rPr>
+        <w:t xml:space="preserve"> </w:t>
+      </w:r>
+      <w:r>
+        <w:rPr>
+          <w:rFonts w:ascii="Times New Roman" w:eastAsia="Times New Roman" w:hAnsi="Times New Roman" w:cs="Times New Roman"/>
+          <w:sz w:val="24"/>
+          <w:szCs w:val="24"/>
+        </w:rPr>
+        <w:t>Caso de uso CU-004: Invitar usuario a hogar</w:t>
+      </w:r>
+      <w:r>
+        <w:rPr>
+          <w:rFonts w:ascii="Times New Roman" w:eastAsia="Times New Roman" w:hAnsi="Times New Roman" w:cs="Times New Roman"/>
+          <w:sz w:val="24"/>
+          <w:szCs w:val="24"/>
+        </w:rPr>
+        <w:tab/>
+      </w:r>
+      <w:r>
+        <w:rPr>
+          <w:rFonts w:ascii="Times New Roman" w:eastAsia="Times New Roman" w:hAnsi="Times New Roman" w:cs="Times New Roman"/>
+          <w:sz w:val="24"/>
+          <w:szCs w:val="24"/>
+        </w:rPr>
+        <w:t>42</w:t>
+      </w:r>
+    </w:p>
+    <w:p>
+      <w:pPr>
+        <w:tabs>
+          <w:tab w:val="right" w:pos="8775"/>
+        </w:tabs>
+        <w:jc w:val="both"/>
+        <w:rPr>
+          <w:rFonts w:ascii="Times New Roman" w:eastAsia="Times New Roman" w:hAnsi="Times New Roman" w:cs="Times New Roman"/>
+          <w:sz w:val="24"/>
+          <w:szCs w:val="24"/>
+        </w:rPr>
+      </w:pPr>
+      <w:r>
+        <w:rPr>
+          <w:rFonts w:ascii="Times New Roman" w:eastAsia="Times New Roman" w:hAnsi="Times New Roman" w:cs="Times New Roman"/>
+          <w:sz w:val="24"/>
+          <w:szCs w:val="24"/>
+        </w:rPr>
+        <w:t xml:space="preserve">Tabla </w:t>
+      </w:r>
+      <w:r>
+        <w:rPr>
+          <w:rFonts w:ascii="Times New Roman" w:eastAsia="Times New Roman" w:hAnsi="Times New Roman" w:cs="Times New Roman"/>
+          <w:sz w:val="24"/>
+          <w:szCs w:val="24"/>
+        </w:rPr>
+        <w:t>4</w:t>
+      </w:r>
+      <w:r>
+        <w:rPr>
+          <w:rFonts w:ascii="Times New Roman" w:eastAsia="Times New Roman" w:hAnsi="Times New Roman" w:cs="Times New Roman"/>
+          <w:sz w:val="24"/>
+          <w:szCs w:val="24"/>
+        </w:rPr>
+        <w:t>.</w:t>
+      </w:r>
+      <w:r>
+        <w:rPr>
+          <w:rFonts w:ascii="Times New Roman" w:eastAsia="Times New Roman" w:hAnsi="Times New Roman" w:cs="Times New Roman"/>
+          <w:sz w:val="24"/>
+          <w:szCs w:val="24"/>
+        </w:rPr>
+        <w:t>6</w:t>
+      </w:r>
+      <w:r>
+        <w:rPr>
+          <w:rFonts w:ascii="Times New Roman" w:eastAsia="Times New Roman" w:hAnsi="Times New Roman" w:cs="Times New Roman"/>
+          <w:sz w:val="24"/>
+          <w:szCs w:val="24"/>
+        </w:rPr>
+        <w:t xml:space="preserve"> </w:t>
+      </w:r>
+      <w:r>
+        <w:rPr>
+          <w:rFonts w:ascii="Times New Roman" w:eastAsia="Times New Roman" w:hAnsi="Times New Roman" w:cs="Times New Roman"/>
+          <w:sz w:val="24"/>
+          <w:szCs w:val="24"/>
+        </w:rPr>
+        <w:t>Caso de uso CU-007: Registrar medicamento</w:t>
+      </w:r>
+      <w:r>
+        <w:rPr>
+          <w:rFonts w:ascii="Times New Roman" w:eastAsia="Times New Roman" w:hAnsi="Times New Roman" w:cs="Times New Roman"/>
+          <w:sz w:val="24"/>
+          <w:szCs w:val="24"/>
+        </w:rPr>
+        <w:tab/>
+      </w:r>
+      <w:r>
+        <w:rPr>
+          <w:rFonts w:ascii="Times New Roman" w:eastAsia="Times New Roman" w:hAnsi="Times New Roman" w:cs="Times New Roman"/>
+          <w:sz w:val="24"/>
+          <w:szCs w:val="24"/>
+        </w:rPr>
+        <w:t>43</w:t>
+      </w:r>
+    </w:p>
+    <w:p>
+      <w:pPr>
+        <w:tabs>
+          <w:tab w:val="right" w:pos="8775"/>
+        </w:tabs>
+        <w:jc w:val="both"/>
+        <w:rPr>
+          <w:rFonts w:ascii="Times New Roman" w:eastAsia="Times New Roman" w:hAnsi="Times New Roman" w:cs="Times New Roman"/>
+          <w:sz w:val="24"/>
+          <w:szCs w:val="24"/>
+        </w:rPr>
+      </w:pPr>
+      <w:r>
+        <w:rPr>
+          <w:rFonts w:ascii="Times New Roman" w:eastAsia="Times New Roman" w:hAnsi="Times New Roman" w:cs="Times New Roman"/>
+          <w:sz w:val="24"/>
+          <w:szCs w:val="24"/>
+        </w:rPr>
+        <w:t xml:space="preserve">Tabla </w:t>
+      </w:r>
+      <w:r>
+        <w:rPr>
+          <w:rFonts w:ascii="Times New Roman" w:eastAsia="Times New Roman" w:hAnsi="Times New Roman" w:cs="Times New Roman"/>
+          <w:sz w:val="24"/>
+          <w:szCs w:val="24"/>
+        </w:rPr>
+        <w:t>4</w:t>
+      </w:r>
+      <w:r>
+        <w:rPr>
+          <w:rFonts w:ascii="Times New Roman" w:eastAsia="Times New Roman" w:hAnsi="Times New Roman" w:cs="Times New Roman"/>
+          <w:sz w:val="24"/>
+          <w:szCs w:val="24"/>
+        </w:rPr>
+        <w:t>.</w:t>
+      </w:r>
+      <w:r>
+        <w:rPr>
+          <w:rFonts w:ascii="Times New Roman" w:eastAsia="Times New Roman" w:hAnsi="Times New Roman" w:cs="Times New Roman"/>
+          <w:sz w:val="24"/>
+          <w:szCs w:val="24"/>
+        </w:rPr>
+        <w:t>7</w:t>
+      </w:r>
+      <w:r>
+        <w:rPr>
+          <w:rFonts w:ascii="Times New Roman" w:eastAsia="Times New Roman" w:hAnsi="Times New Roman" w:cs="Times New Roman"/>
+          <w:sz w:val="24"/>
+          <w:szCs w:val="24"/>
+        </w:rPr>
+        <w:t xml:space="preserve"> </w:t>
+      </w:r>
+      <w:r>
+        <w:rPr>
+          <w:rFonts w:ascii="Times New Roman" w:eastAsia="Times New Roman" w:hAnsi="Times New Roman" w:cs="Times New Roman"/>
+          <w:sz w:val="24"/>
+          <w:szCs w:val="24"/>
+        </w:rPr>
+        <w:t>Caso de uso CU-008: Registrar toma de medicamento</w:t>
+      </w:r>
+      <w:r>
+        <w:rPr>
+          <w:rFonts w:ascii="Times New Roman" w:eastAsia="Times New Roman" w:hAnsi="Times New Roman" w:cs="Times New Roman"/>
+          <w:sz w:val="24"/>
+          <w:szCs w:val="24"/>
+        </w:rPr>
+        <w:tab/>
+      </w:r>
+      <w:r>
+        <w:rPr>
+          <w:rFonts w:ascii="Times New Roman" w:eastAsia="Times New Roman" w:hAnsi="Times New Roman" w:cs="Times New Roman"/>
+          <w:sz w:val="24"/>
+          <w:szCs w:val="24"/>
+        </w:rPr>
+        <w:t>44</w:t>
       </w:r>
     </w:p>
     <w:p>
@@ -12077,6 +12614,27 @@
         </w:rPr>
       </w:pPr>
     </w:p>
+    <w:p>
+      <w:pPr>
+        <w:pStyle w:val="Descripcin"/>
+        <w:keepNext/>
+      </w:pPr>
+      <w:r>
+        <w:lastRenderedPageBreak/>
+        <w:t xml:space="preserve">Tabla </w:t>
+      </w:r>
+      <w:fldSimple w:instr=" SEQ Tabla \* ARABIC ">
+        <w:r>
+          <w:rPr>
+            <w:noProof/>
+          </w:rPr>
+          <w:t>1</w:t>
+        </w:r>
+      </w:fldSimple>
+      <w:r>
+        <w:t>: Tabla comparativa de herramientas del mercado</w:t>
+      </w:r>
+    </w:p>
     <w:tbl>
       <w:tblPr>
         <w:tblStyle w:val="Tablaconcuadrcula"/>
@@ -12251,7 +12809,6 @@
                 <w:sz w:val="24"/>
                 <w:szCs w:val="24"/>
               </w:rPr>
-              <w:lastRenderedPageBreak/>
               <w:t>Plataforma</w:t>
             </w:r>
           </w:p>
@@ -14010,6 +14567,7 @@
           <w:sz w:val="36"/>
           <w:szCs w:val="36"/>
         </w:rPr>
+        <w:lastRenderedPageBreak/>
         <w:t>2.3.- VALORACIÓN</w:t>
       </w:r>
     </w:p>
@@ -19238,6 +19796,15 @@
         </w:rPr>
       </w:pPr>
     </w:p>
+    <w:p>
+      <w:pPr>
+        <w:pStyle w:val="Descripcin"/>
+        <w:keepNext/>
+      </w:pPr>
+      <w:r>
+        <w:t>Tabla 1: Actores del sistema CarePet</w:t>
+      </w:r>
+    </w:p>
     <w:tbl>
       <w:tblPr>
         <w:tblStyle w:val="Tablaconcuadrcula"/>
@@ -19460,6 +20027,7 @@
                 <w:sz w:val="24"/>
                 <w:szCs w:val="24"/>
               </w:rPr>
+              <w:lastRenderedPageBreak/>
               <w:t>Administrador (ADMIN)</w:t>
             </w:r>
           </w:p>
@@ -19508,7 +20076,6 @@
                 <w:sz w:val="24"/>
                 <w:szCs w:val="24"/>
               </w:rPr>
-              <w:lastRenderedPageBreak/>
               <w:t>Miembro (MEMBER)</w:t>
             </w:r>
           </w:p>
@@ -19697,6 +20264,26 @@
           <w:szCs w:val="24"/>
         </w:rPr>
       </w:pPr>
+    </w:p>
+    <w:p>
+      <w:pPr>
+        <w:pStyle w:val="Descripcin"/>
+        <w:keepNext/>
+      </w:pPr>
+      <w:r>
+        <w:t xml:space="preserve">Tabla </w:t>
+      </w:r>
+      <w:fldSimple w:instr=" SEQ Tabla \* ARABIC ">
+        <w:r>
+          <w:rPr>
+            <w:noProof/>
+          </w:rPr>
+          <w:t>2</w:t>
+        </w:r>
+      </w:fldSimple>
+      <w:r>
+        <w:t>: Requisitos funcionales</w:t>
+      </w:r>
     </w:p>
     <w:tbl>
       <w:tblPr>
@@ -20952,6 +21539,7 @@
                 <w:sz w:val="24"/>
                 <w:szCs w:val="24"/>
               </w:rPr>
+              <w:lastRenderedPageBreak/>
               <w:t>RF-013</w:t>
             </w:r>
           </w:p>
@@ -21046,7 +21634,6 @@
                 <w:sz w:val="24"/>
                 <w:szCs w:val="24"/>
               </w:rPr>
-              <w:lastRenderedPageBreak/>
               <w:t>RF-014</w:t>
             </w:r>
           </w:p>
@@ -22645,6 +23232,7 @@
                 <w:sz w:val="24"/>
                 <w:szCs w:val="24"/>
               </w:rPr>
+              <w:lastRenderedPageBreak/>
               <w:t>RF-031</w:t>
             </w:r>
           </w:p>
@@ -22714,16 +23302,7 @@
                 <w:sz w:val="24"/>
                 <w:szCs w:val="24"/>
               </w:rPr>
-              <w:t xml:space="preserve">Implementado con limitaciones — la funcionalidad está presente pero no </w:t>
-            </w:r>
-            <w:r>
-              <w:rPr>
-                <w:rFonts w:ascii="Times New Roman" w:eastAsia="Times New Roman" w:hAnsi="Times New Roman" w:cs="Times New Roman"/>
-                <w:sz w:val="24"/>
-                <w:szCs w:val="24"/>
-              </w:rPr>
-              <w:lastRenderedPageBreak/>
-              <w:t>opera correctamente en todos los casos.</w:t>
+              <w:t>Implementado con limitaciones — la funcionalidad está presente pero no opera correctamente en todos los casos.</w:t>
             </w:r>
           </w:p>
         </w:tc>
@@ -24345,6 +24924,7 @@
                 <w:sz w:val="24"/>
                 <w:szCs w:val="24"/>
               </w:rPr>
+              <w:lastRenderedPageBreak/>
               <w:t>RF-049</w:t>
             </w:r>
           </w:p>
@@ -24439,7 +25019,6 @@
                 <w:sz w:val="24"/>
                 <w:szCs w:val="24"/>
               </w:rPr>
-              <w:lastRenderedPageBreak/>
               <w:t>RF-050</w:t>
             </w:r>
           </w:p>
@@ -26336,6 +26915,7 @@
                 <w:sz w:val="24"/>
                 <w:szCs w:val="24"/>
               </w:rPr>
+              <w:lastRenderedPageBreak/>
               <w:t>RF-070</w:t>
             </w:r>
           </w:p>
@@ -26524,7 +27104,6 @@
                 <w:sz w:val="24"/>
                 <w:szCs w:val="24"/>
               </w:rPr>
-              <w:lastRenderedPageBreak/>
               <w:t>RF-072</w:t>
             </w:r>
           </w:p>
@@ -26811,6 +27390,26 @@
           <w:szCs w:val="24"/>
         </w:rPr>
       </w:pPr>
+    </w:p>
+    <w:p>
+      <w:pPr>
+        <w:pStyle w:val="Descripcin"/>
+        <w:keepNext/>
+      </w:pPr>
+      <w:r>
+        <w:t xml:space="preserve">Tabla </w:t>
+      </w:r>
+      <w:fldSimple w:instr=" SEQ Tabla \* ARABIC ">
+        <w:r>
+          <w:rPr>
+            <w:noProof/>
+          </w:rPr>
+          <w:t>3</w:t>
+        </w:r>
+      </w:fldSimple>
+      <w:r>
+        <w:t>: Requisitos no funcionales</w:t>
+      </w:r>
     </w:p>
     <w:tbl>
       <w:tblPr>
@@ -27615,6 +28214,7 @@
           <w:sz w:val="24"/>
           <w:szCs w:val="24"/>
         </w:rPr>
+        <w:lastRenderedPageBreak/>
         <w:t>CU-001: Registro de usuario</w:t>
       </w:r>
     </w:p>
@@ -27634,6 +28234,26 @@
           <w:szCs w:val="24"/>
         </w:rPr>
       </w:pPr>
+    </w:p>
+    <w:p>
+      <w:pPr>
+        <w:pStyle w:val="Descripcin"/>
+        <w:keepNext/>
+      </w:pPr>
+      <w:r>
+        <w:t xml:space="preserve">Tabla </w:t>
+      </w:r>
+      <w:fldSimple w:instr=" SEQ Tabla \* ARABIC ">
+        <w:r>
+          <w:rPr>
+            <w:noProof/>
+          </w:rPr>
+          <w:t>4</w:t>
+        </w:r>
+      </w:fldSimple>
+      <w:r>
+        <w:t>: Caso de uso CU-001: Registro de usuario</w:t>
+      </w:r>
     </w:p>
     <w:tbl>
       <w:tblPr>
@@ -27857,7 +28477,6 @@
                 <w:sz w:val="24"/>
                 <w:szCs w:val="24"/>
               </w:rPr>
-              <w:lastRenderedPageBreak/>
               <w:t>Precondición</w:t>
             </w:r>
           </w:p>
@@ -28423,6 +29042,26 @@
           <w:szCs w:val="24"/>
         </w:rPr>
       </w:pPr>
+    </w:p>
+    <w:p>
+      <w:pPr>
+        <w:pStyle w:val="Descripcin"/>
+        <w:keepNext/>
+      </w:pPr>
+      <w:r>
+        <w:t xml:space="preserve">Tabla </w:t>
+      </w:r>
+      <w:fldSimple w:instr=" SEQ Tabla \* ARABIC ">
+        <w:r>
+          <w:rPr>
+            <w:noProof/>
+          </w:rPr>
+          <w:t>5</w:t>
+        </w:r>
+      </w:fldSimple>
+      <w:r>
+        <w:t>: Caso de uso CU-004: Invitar usuario a hogar</w:t>
+      </w:r>
     </w:p>
     <w:tbl>
       <w:tblPr>
@@ -28813,6 +29452,7 @@
           <w:sz w:val="24"/>
           <w:szCs w:val="24"/>
         </w:rPr>
+        <w:lastRenderedPageBreak/>
         <w:t>El actor accede al detalle del hogar.</w:t>
       </w:r>
     </w:p>
@@ -29211,6 +29851,26 @@
           <w:szCs w:val="24"/>
         </w:rPr>
       </w:pPr>
+    </w:p>
+    <w:p>
+      <w:pPr>
+        <w:pStyle w:val="Descripcin"/>
+        <w:keepNext/>
+      </w:pPr>
+      <w:r>
+        <w:t xml:space="preserve">Tabla </w:t>
+      </w:r>
+      <w:fldSimple w:instr=" SEQ Tabla \* ARABIC ">
+        <w:r>
+          <w:rPr>
+            <w:noProof/>
+          </w:rPr>
+          <w:t>6</w:t>
+        </w:r>
+      </w:fldSimple>
+      <w:r>
+        <w:t>: Caso de uso CU-007: Registrar medicamento</w:t>
+      </w:r>
     </w:p>
     <w:tbl>
       <w:tblPr>
@@ -29920,6 +30580,7 @@
           <w:sz w:val="24"/>
           <w:szCs w:val="24"/>
         </w:rPr>
+        <w:lastRenderedPageBreak/>
         <w:t>CU-008: Registrar toma de medicamento</w:t>
       </w:r>
     </w:p>
@@ -29939,6 +30600,26 @@
           <w:szCs w:val="24"/>
         </w:rPr>
       </w:pPr>
+    </w:p>
+    <w:p>
+      <w:pPr>
+        <w:pStyle w:val="Descripcin"/>
+        <w:keepNext/>
+      </w:pPr>
+      <w:r>
+        <w:t xml:space="preserve">Tabla </w:t>
+      </w:r>
+      <w:fldSimple w:instr=" SEQ Tabla \* ARABIC ">
+        <w:r>
+          <w:rPr>
+            <w:noProof/>
+          </w:rPr>
+          <w:t>7</w:t>
+        </w:r>
+      </w:fldSimple>
+      <w:r>
+        <w:t>: Caso de uso CU-008: Registrar toma de medicamento</w:t>
+      </w:r>
     </w:p>
     <w:tbl>
       <w:tblPr>
@@ -30881,6 +31562,7 @@
           <w:sz w:val="24"/>
           <w:szCs w:val="24"/>
         </w:rPr>
+        <w:lastRenderedPageBreak/>
         <w:t>CU-006</w:t>
       </w:r>
       <w:r>
@@ -31061,7 +31743,6 @@
           <w:sz w:val="36"/>
           <w:szCs w:val="36"/>
         </w:rPr>
-        <w:lastRenderedPageBreak/>
         <w:t>4.3.- Diseño</w:t>
       </w:r>
     </w:p>
@@ -31276,6 +31957,7 @@
           <w:sz w:val="24"/>
           <w:szCs w:val="24"/>
         </w:rPr>
+        <w:lastRenderedPageBreak/>
         <w:drawing>
           <wp:inline distT="0" distB="0" distL="0" distR="0" wp14:anchorId="163F2FEA" wp14:editId="111DE2BA">
             <wp:extent cx="4422140" cy="5222231"/>
@@ -31372,7 +32054,6 @@
           <w:sz w:val="24"/>
           <w:szCs w:val="24"/>
         </w:rPr>
-        <w:lastRenderedPageBreak/>
         <w:t xml:space="preserve">En el área de usuarios y hogares, la tabla </w:t>
       </w:r>
       <w:r>
@@ -31583,7 +32264,16 @@
           <w:sz w:val="24"/>
           <w:szCs w:val="24"/>
         </w:rPr>
-        <w:t xml:space="preserve"> almacena la configuración de cada medicamento, mientras que </w:t>
+        <w:t xml:space="preserve"> almacena la </w:t>
+      </w:r>
+      <w:r>
+        <w:rPr>
+          <w:rFonts w:ascii="Times New Roman" w:eastAsia="Times New Roman" w:hAnsi="Times New Roman" w:cs="Times New Roman"/>
+          <w:sz w:val="24"/>
+          <w:szCs w:val="24"/>
+        </w:rPr>
+        <w:lastRenderedPageBreak/>
+        <w:t xml:space="preserve">configuración de cada medicamento, mientras que </w:t>
       </w:r>
       <w:r>
         <w:rPr>
@@ -31849,7 +32539,6 @@
           <w:sz w:val="24"/>
           <w:szCs w:val="24"/>
         </w:rPr>
-        <w:lastRenderedPageBreak/>
         <w:t>El diagrama anterior muestra las principales clases del modelo de dominio del backend de CarePet, sus atributos, sus métodos y las relaciones de asociación entre ellas. Dado que el proyecto sigue el patrón de mapeo objeto-relacional mediante JPA, la estructura del diagrama de clases es equivalente a la del diagrama entidad-relación presentado en el apartado anterior, con la diferencia de que el primero incorpora los métodos de negocio de cada entidad y utiliza tipos propios del lenguaje Java en lugar de tipos SQL.</w:t>
       </w:r>
     </w:p>
@@ -32062,6 +32751,7 @@
           <w:sz w:val="24"/>
           <w:szCs w:val="24"/>
         </w:rPr>
+        <w:lastRenderedPageBreak/>
         <w:t xml:space="preserve">La clase </w:t>
       </w:r>
       <w:r>
@@ -32494,7 +33184,6 @@
           <w:sz w:val="24"/>
           <w:szCs w:val="24"/>
         </w:rPr>
-        <w:lastRenderedPageBreak/>
         <w:drawing>
           <wp:inline distT="0" distB="0" distL="0" distR="0" wp14:anchorId="56064F70" wp14:editId="4B225048">
             <wp:extent cx="4426158" cy="3124200"/>
@@ -32637,6 +33326,7 @@
           <w:sz w:val="24"/>
           <w:szCs w:val="24"/>
         </w:rPr>
+        <w:lastRenderedPageBreak/>
         <w:t>Ahora, este</w:t>
       </w:r>
       <w:r>
@@ -32684,7 +33374,6 @@
           <w:sz w:val="24"/>
           <w:szCs w:val="24"/>
         </w:rPr>
-        <w:lastRenderedPageBreak/>
         <w:drawing>
           <wp:inline distT="0" distB="0" distL="0" distR="0" wp14:anchorId="7E6EB6C4" wp14:editId="78666A85">
             <wp:extent cx="4173890" cy="3314700"/>
@@ -32879,6 +33568,7 @@
           <w:sz w:val="24"/>
           <w:szCs w:val="24"/>
         </w:rPr>
+        <w:lastRenderedPageBreak/>
         <w:drawing>
           <wp:inline distT="0" distB="0" distL="0" distR="0" wp14:anchorId="0C11711F" wp14:editId="142D6F08">
             <wp:extent cx="5580380" cy="3073400"/>
@@ -33253,7 +33943,6 @@
           <w:sz w:val="24"/>
           <w:szCs w:val="24"/>
         </w:rPr>
-        <w:lastRenderedPageBreak/>
         <w:drawing>
           <wp:inline distT="0" distB="0" distL="0" distR="0" wp14:anchorId="2E09454C" wp14:editId="34B441B6">
             <wp:extent cx="5580380" cy="5252085"/>
@@ -33434,16 +34123,7 @@
           <w:sz w:val="24"/>
           <w:szCs w:val="24"/>
         </w:rPr>
-        <w:t xml:space="preserve">Si el medicamento está activo, el servicio ejecuta una segunda consulta que cuenta el número de tomas registradas para ese medicamento en el día actual y lo compara con el número máximo de tomas permitidas según la frecuencia configurada. Si el contador ha alcanzado o superado el límite, el sistema devuelve un error 409 Conflict con un mensaje informativo. Si </w:t>
-      </w:r>
-      <w:r>
-        <w:rPr>
-          <w:rFonts w:ascii="Times New Roman" w:eastAsia="Times New Roman" w:hAnsi="Times New Roman" w:cs="Times New Roman"/>
-          <w:sz w:val="24"/>
-          <w:szCs w:val="24"/>
-        </w:rPr>
-        <w:lastRenderedPageBreak/>
-        <w:t xml:space="preserve">el contador es inferior al límite, el sistema inserta el nuevo registro en la tabla </w:t>
+        <w:t xml:space="preserve">Si el medicamento está activo, el servicio ejecuta una segunda consulta que cuenta el número de tomas registradas para ese medicamento en el día actual y lo compara con el número máximo de tomas permitidas según la frecuencia configurada. Si el contador ha alcanzado o superado el límite, el sistema devuelve un error 409 Conflict con un mensaje informativo. Si el contador es inferior al límite, el sistema inserta el nuevo registro en la tabla </w:t>
       </w:r>
       <w:r>
         <w:rPr>
@@ -37992,14 +38672,7 @@
       <w:r>
         <w:t>29</w:t>
       </w:r>
-      <w:fldSimple w:instr=" SEQ Ilustración \* ARABIC ">
-        <w:r>
-          <w:rPr>
-            <w:noProof/>
-          </w:rPr>
-          <w:t>18</w:t>
-        </w:r>
-      </w:fldSimple>
+      <w:fldSimple w:instr=" SEQ Ilustración \* ARABIC "/>
       <w:r>
         <w:t>: Registrar toma de medicamento (éxito)</w:t>
       </w:r>

</xml_diff>

<commit_message>
Capitulos unidos updated with main index complete
</commit_message>
<xml_diff>
--- a/docs/Capitulos unidos.docx
+++ b/docs/Capitulos unidos.docx
@@ -291,7 +291,14 @@
           <w:szCs w:val="24"/>
         </w:rPr>
         <w:tab/>
-        <w:t>x</w:t>
+      </w:r>
+      <w:r>
+        <w:rPr>
+          <w:rFonts w:ascii="Times New Roman" w:eastAsia="Times New Roman" w:hAnsi="Times New Roman" w:cs="Times New Roman"/>
+          <w:sz w:val="24"/>
+          <w:szCs w:val="24"/>
+        </w:rPr>
+        <w:t>6</w:t>
       </w:r>
     </w:p>
     <w:p>
@@ -329,7 +336,14 @@
           <w:szCs w:val="24"/>
         </w:rPr>
         <w:tab/>
-        <w:t>x</w:t>
+      </w:r>
+      <w:r>
+        <w:rPr>
+          <w:rFonts w:ascii="Times New Roman" w:eastAsia="Times New Roman" w:hAnsi="Times New Roman" w:cs="Times New Roman"/>
+          <w:sz w:val="24"/>
+          <w:szCs w:val="24"/>
+        </w:rPr>
+        <w:t>6</w:t>
       </w:r>
     </w:p>
     <w:p>
@@ -359,7 +373,14 @@
           <w:szCs w:val="24"/>
         </w:rPr>
         <w:tab/>
-        <w:t>x</w:t>
+      </w:r>
+      <w:r>
+        <w:rPr>
+          <w:rFonts w:ascii="Times New Roman" w:eastAsia="Times New Roman" w:hAnsi="Times New Roman" w:cs="Times New Roman"/>
+          <w:sz w:val="24"/>
+          <w:szCs w:val="24"/>
+        </w:rPr>
+        <w:t>7</w:t>
       </w:r>
     </w:p>
     <w:p>
@@ -389,7 +410,14 @@
           <w:szCs w:val="24"/>
         </w:rPr>
         <w:tab/>
-        <w:t>x</w:t>
+      </w:r>
+      <w:r>
+        <w:rPr>
+          <w:rFonts w:ascii="Times New Roman" w:eastAsia="Times New Roman" w:hAnsi="Times New Roman" w:cs="Times New Roman"/>
+          <w:sz w:val="24"/>
+          <w:szCs w:val="24"/>
+        </w:rPr>
+        <w:t>7</w:t>
       </w:r>
     </w:p>
     <w:p>
@@ -419,7 +447,14 @@
           <w:szCs w:val="24"/>
         </w:rPr>
         <w:tab/>
-        <w:t>x</w:t>
+      </w:r>
+      <w:r>
+        <w:rPr>
+          <w:rFonts w:ascii="Times New Roman" w:eastAsia="Times New Roman" w:hAnsi="Times New Roman" w:cs="Times New Roman"/>
+          <w:sz w:val="24"/>
+          <w:szCs w:val="24"/>
+        </w:rPr>
+        <w:t>8</w:t>
       </w:r>
     </w:p>
     <w:p>
@@ -449,7 +484,14 @@
           <w:szCs w:val="24"/>
         </w:rPr>
         <w:tab/>
-        <w:t>x</w:t>
+      </w:r>
+      <w:r>
+        <w:rPr>
+          <w:rFonts w:ascii="Times New Roman" w:eastAsia="Times New Roman" w:hAnsi="Times New Roman" w:cs="Times New Roman"/>
+          <w:sz w:val="24"/>
+          <w:szCs w:val="24"/>
+        </w:rPr>
+        <w:t>8</w:t>
       </w:r>
     </w:p>
     <w:p>
@@ -479,7 +521,14 @@
           <w:szCs w:val="24"/>
         </w:rPr>
         <w:tab/>
-        <w:t>x</w:t>
+      </w:r>
+      <w:r>
+        <w:rPr>
+          <w:rFonts w:ascii="Times New Roman" w:eastAsia="Times New Roman" w:hAnsi="Times New Roman" w:cs="Times New Roman"/>
+          <w:sz w:val="24"/>
+          <w:szCs w:val="24"/>
+        </w:rPr>
+        <w:t>9</w:t>
       </w:r>
     </w:p>
     <w:p>
@@ -509,7 +558,14 @@
           <w:szCs w:val="24"/>
         </w:rPr>
         <w:tab/>
-        <w:t>x</w:t>
+      </w:r>
+      <w:r>
+        <w:rPr>
+          <w:rFonts w:ascii="Times New Roman" w:eastAsia="Times New Roman" w:hAnsi="Times New Roman" w:cs="Times New Roman"/>
+          <w:sz w:val="24"/>
+          <w:szCs w:val="24"/>
+        </w:rPr>
+        <w:t>9</w:t>
       </w:r>
     </w:p>
     <w:p>
@@ -539,7 +595,14 @@
           <w:szCs w:val="24"/>
         </w:rPr>
         <w:tab/>
-        <w:t>x</w:t>
+      </w:r>
+      <w:r>
+        <w:rPr>
+          <w:rFonts w:ascii="Times New Roman" w:eastAsia="Times New Roman" w:hAnsi="Times New Roman" w:cs="Times New Roman"/>
+          <w:sz w:val="24"/>
+          <w:szCs w:val="24"/>
+        </w:rPr>
+        <w:t>9</w:t>
       </w:r>
     </w:p>
     <w:p>
@@ -569,7 +632,14 @@
           <w:szCs w:val="24"/>
         </w:rPr>
         <w:tab/>
-        <w:t>x</w:t>
+      </w:r>
+      <w:r>
+        <w:rPr>
+          <w:rFonts w:ascii="Times New Roman" w:eastAsia="Times New Roman" w:hAnsi="Times New Roman" w:cs="Times New Roman"/>
+          <w:sz w:val="24"/>
+          <w:szCs w:val="24"/>
+        </w:rPr>
+        <w:t>10</w:t>
       </w:r>
     </w:p>
     <w:p>
@@ -599,7 +669,14 @@
           <w:szCs w:val="24"/>
         </w:rPr>
         <w:tab/>
-        <w:t>x</w:t>
+      </w:r>
+      <w:r>
+        <w:rPr>
+          <w:rFonts w:ascii="Times New Roman" w:eastAsia="Times New Roman" w:hAnsi="Times New Roman" w:cs="Times New Roman"/>
+          <w:sz w:val="24"/>
+          <w:szCs w:val="24"/>
+        </w:rPr>
+        <w:t>11</w:t>
       </w:r>
     </w:p>
     <w:p>
@@ -642,7 +719,14 @@
           <w:szCs w:val="24"/>
         </w:rPr>
         <w:tab/>
-        <w:t>x</w:t>
+      </w:r>
+      <w:r>
+        <w:rPr>
+          <w:rFonts w:ascii="Times New Roman" w:eastAsia="Times New Roman" w:hAnsi="Times New Roman" w:cs="Times New Roman"/>
+          <w:sz w:val="24"/>
+          <w:szCs w:val="24"/>
+        </w:rPr>
+        <w:t>12</w:t>
       </w:r>
     </w:p>
     <w:p>
@@ -672,7 +756,14 @@
           <w:szCs w:val="24"/>
         </w:rPr>
         <w:tab/>
-        <w:t>x</w:t>
+      </w:r>
+      <w:r>
+        <w:rPr>
+          <w:rFonts w:ascii="Times New Roman" w:eastAsia="Times New Roman" w:hAnsi="Times New Roman" w:cs="Times New Roman"/>
+          <w:sz w:val="24"/>
+          <w:szCs w:val="24"/>
+        </w:rPr>
+        <w:t>12</w:t>
       </w:r>
     </w:p>
     <w:p>
@@ -702,7 +793,14 @@
           <w:szCs w:val="24"/>
         </w:rPr>
         <w:tab/>
-        <w:t>x</w:t>
+      </w:r>
+      <w:r>
+        <w:rPr>
+          <w:rFonts w:ascii="Times New Roman" w:eastAsia="Times New Roman" w:hAnsi="Times New Roman" w:cs="Times New Roman"/>
+          <w:sz w:val="24"/>
+          <w:szCs w:val="24"/>
+        </w:rPr>
+        <w:t>13</w:t>
       </w:r>
     </w:p>
     <w:p>
@@ -732,7 +830,14 @@
           <w:szCs w:val="24"/>
         </w:rPr>
         <w:tab/>
-        <w:t>x</w:t>
+      </w:r>
+      <w:r>
+        <w:rPr>
+          <w:rFonts w:ascii="Times New Roman" w:eastAsia="Times New Roman" w:hAnsi="Times New Roman" w:cs="Times New Roman"/>
+          <w:sz w:val="24"/>
+          <w:szCs w:val="24"/>
+        </w:rPr>
+        <w:t>13</w:t>
       </w:r>
     </w:p>
     <w:p>
@@ -762,7 +867,14 @@
           <w:szCs w:val="24"/>
         </w:rPr>
         <w:tab/>
-        <w:t>x</w:t>
+      </w:r>
+      <w:r>
+        <w:rPr>
+          <w:rFonts w:ascii="Times New Roman" w:eastAsia="Times New Roman" w:hAnsi="Times New Roman" w:cs="Times New Roman"/>
+          <w:sz w:val="24"/>
+          <w:szCs w:val="24"/>
+        </w:rPr>
+        <w:t>15</w:t>
       </w:r>
     </w:p>
     <w:p>
@@ -792,7 +904,14 @@
           <w:szCs w:val="24"/>
         </w:rPr>
         <w:tab/>
-        <w:t>x</w:t>
+      </w:r>
+      <w:r>
+        <w:rPr>
+          <w:rFonts w:ascii="Times New Roman" w:eastAsia="Times New Roman" w:hAnsi="Times New Roman" w:cs="Times New Roman"/>
+          <w:sz w:val="24"/>
+          <w:szCs w:val="24"/>
+        </w:rPr>
+        <w:t>16</w:t>
       </w:r>
     </w:p>
     <w:p>
@@ -822,7 +941,14 @@
           <w:szCs w:val="24"/>
         </w:rPr>
         <w:tab/>
-        <w:t>x</w:t>
+      </w:r>
+      <w:r>
+        <w:rPr>
+          <w:rFonts w:ascii="Times New Roman" w:eastAsia="Times New Roman" w:hAnsi="Times New Roman" w:cs="Times New Roman"/>
+          <w:sz w:val="24"/>
+          <w:szCs w:val="24"/>
+        </w:rPr>
+        <w:t>18</w:t>
       </w:r>
     </w:p>
     <w:p>
@@ -852,7 +978,14 @@
           <w:szCs w:val="24"/>
         </w:rPr>
         <w:tab/>
-        <w:t>x</w:t>
+      </w:r>
+      <w:r>
+        <w:rPr>
+          <w:rFonts w:ascii="Times New Roman" w:eastAsia="Times New Roman" w:hAnsi="Times New Roman" w:cs="Times New Roman"/>
+          <w:sz w:val="24"/>
+          <w:szCs w:val="24"/>
+        </w:rPr>
+        <w:t>20</w:t>
       </w:r>
     </w:p>
     <w:p>
@@ -882,7 +1015,14 @@
           <w:szCs w:val="24"/>
         </w:rPr>
         <w:tab/>
-        <w:t>x</w:t>
+      </w:r>
+      <w:r>
+        <w:rPr>
+          <w:rFonts w:ascii="Times New Roman" w:eastAsia="Times New Roman" w:hAnsi="Times New Roman" w:cs="Times New Roman"/>
+          <w:sz w:val="24"/>
+          <w:szCs w:val="24"/>
+        </w:rPr>
+        <w:t>21</w:t>
       </w:r>
     </w:p>
     <w:p>
@@ -912,7 +1052,14 @@
           <w:szCs w:val="24"/>
         </w:rPr>
         <w:tab/>
-        <w:t>x</w:t>
+      </w:r>
+      <w:r>
+        <w:rPr>
+          <w:rFonts w:ascii="Times New Roman" w:eastAsia="Times New Roman" w:hAnsi="Times New Roman" w:cs="Times New Roman"/>
+          <w:sz w:val="24"/>
+          <w:szCs w:val="24"/>
+        </w:rPr>
+        <w:t>22</w:t>
       </w:r>
     </w:p>
     <w:p>
@@ -971,7 +1118,14 @@
           <w:szCs w:val="24"/>
         </w:rPr>
         <w:tab/>
-        <w:t>x</w:t>
+      </w:r>
+      <w:r>
+        <w:rPr>
+          <w:rFonts w:ascii="Times New Roman" w:eastAsia="Times New Roman" w:hAnsi="Times New Roman" w:cs="Times New Roman"/>
+          <w:sz w:val="24"/>
+          <w:szCs w:val="24"/>
+        </w:rPr>
+        <w:t>24</w:t>
       </w:r>
     </w:p>
     <w:p>
@@ -1001,7 +1155,14 @@
           <w:szCs w:val="24"/>
         </w:rPr>
         <w:tab/>
-        <w:t>x</w:t>
+      </w:r>
+      <w:r>
+        <w:rPr>
+          <w:rFonts w:ascii="Times New Roman" w:eastAsia="Times New Roman" w:hAnsi="Times New Roman" w:cs="Times New Roman"/>
+          <w:sz w:val="24"/>
+          <w:szCs w:val="24"/>
+        </w:rPr>
+        <w:t>24</w:t>
       </w:r>
     </w:p>
     <w:p>
@@ -1031,7 +1192,14 @@
           <w:szCs w:val="24"/>
         </w:rPr>
         <w:tab/>
-        <w:t>x</w:t>
+      </w:r>
+      <w:r>
+        <w:rPr>
+          <w:rFonts w:ascii="Times New Roman" w:eastAsia="Times New Roman" w:hAnsi="Times New Roman" w:cs="Times New Roman"/>
+          <w:sz w:val="24"/>
+          <w:szCs w:val="24"/>
+        </w:rPr>
+        <w:t>25</w:t>
       </w:r>
     </w:p>
     <w:p>
@@ -1061,7 +1229,14 @@
           <w:szCs w:val="24"/>
         </w:rPr>
         <w:tab/>
-        <w:t>x</w:t>
+      </w:r>
+      <w:r>
+        <w:rPr>
+          <w:rFonts w:ascii="Times New Roman" w:eastAsia="Times New Roman" w:hAnsi="Times New Roman" w:cs="Times New Roman"/>
+          <w:sz w:val="24"/>
+          <w:szCs w:val="24"/>
+        </w:rPr>
+        <w:t>25</w:t>
       </w:r>
     </w:p>
     <w:p>
@@ -1091,7 +1266,14 @@
           <w:szCs w:val="24"/>
         </w:rPr>
         <w:tab/>
-        <w:t>x</w:t>
+      </w:r>
+      <w:r>
+        <w:rPr>
+          <w:rFonts w:ascii="Times New Roman" w:eastAsia="Times New Roman" w:hAnsi="Times New Roman" w:cs="Times New Roman"/>
+          <w:sz w:val="24"/>
+          <w:szCs w:val="24"/>
+        </w:rPr>
+        <w:t>25</w:t>
       </w:r>
     </w:p>
     <w:p>
@@ -1121,7 +1303,14 @@
           <w:szCs w:val="24"/>
         </w:rPr>
         <w:tab/>
-        <w:t>x</w:t>
+      </w:r>
+      <w:r>
+        <w:rPr>
+          <w:rFonts w:ascii="Times New Roman" w:eastAsia="Times New Roman" w:hAnsi="Times New Roman" w:cs="Times New Roman"/>
+          <w:sz w:val="24"/>
+          <w:szCs w:val="24"/>
+        </w:rPr>
+        <w:t>26</w:t>
       </w:r>
     </w:p>
     <w:p>
@@ -1151,7 +1340,14 @@
           <w:szCs w:val="24"/>
         </w:rPr>
         <w:tab/>
-        <w:t>x</w:t>
+      </w:r>
+      <w:r>
+        <w:rPr>
+          <w:rFonts w:ascii="Times New Roman" w:eastAsia="Times New Roman" w:hAnsi="Times New Roman" w:cs="Times New Roman"/>
+          <w:sz w:val="24"/>
+          <w:szCs w:val="24"/>
+        </w:rPr>
+        <w:t>26</w:t>
       </w:r>
     </w:p>
     <w:p>
@@ -1181,7 +1377,14 @@
           <w:szCs w:val="24"/>
         </w:rPr>
         <w:tab/>
-        <w:t>x</w:t>
+      </w:r>
+      <w:r>
+        <w:rPr>
+          <w:rFonts w:ascii="Times New Roman" w:eastAsia="Times New Roman" w:hAnsi="Times New Roman" w:cs="Times New Roman"/>
+          <w:sz w:val="24"/>
+          <w:szCs w:val="24"/>
+        </w:rPr>
+        <w:t>26</w:t>
       </w:r>
     </w:p>
     <w:p>
@@ -1211,7 +1414,14 @@
           <w:szCs w:val="24"/>
         </w:rPr>
         <w:tab/>
-        <w:t>x</w:t>
+      </w:r>
+      <w:r>
+        <w:rPr>
+          <w:rFonts w:ascii="Times New Roman" w:eastAsia="Times New Roman" w:hAnsi="Times New Roman" w:cs="Times New Roman"/>
+          <w:sz w:val="24"/>
+          <w:szCs w:val="24"/>
+        </w:rPr>
+        <w:t>27</w:t>
       </w:r>
     </w:p>
     <w:p>
@@ -1241,7 +1451,14 @@
           <w:szCs w:val="24"/>
         </w:rPr>
         <w:tab/>
-        <w:t>x</w:t>
+      </w:r>
+      <w:r>
+        <w:rPr>
+          <w:rFonts w:ascii="Times New Roman" w:eastAsia="Times New Roman" w:hAnsi="Times New Roman" w:cs="Times New Roman"/>
+          <w:sz w:val="24"/>
+          <w:szCs w:val="24"/>
+        </w:rPr>
+        <w:t>27</w:t>
       </w:r>
     </w:p>
     <w:p>
@@ -1271,7 +1488,14 @@
           <w:szCs w:val="24"/>
         </w:rPr>
         <w:tab/>
-        <w:t>x</w:t>
+      </w:r>
+      <w:r>
+        <w:rPr>
+          <w:rFonts w:ascii="Times New Roman" w:eastAsia="Times New Roman" w:hAnsi="Times New Roman" w:cs="Times New Roman"/>
+          <w:sz w:val="24"/>
+          <w:szCs w:val="24"/>
+        </w:rPr>
+        <w:t>28</w:t>
       </w:r>
     </w:p>
     <w:p>
@@ -1301,7 +1525,14 @@
           <w:szCs w:val="24"/>
         </w:rPr>
         <w:tab/>
-        <w:t>x</w:t>
+      </w:r>
+      <w:r>
+        <w:rPr>
+          <w:rFonts w:ascii="Times New Roman" w:eastAsia="Times New Roman" w:hAnsi="Times New Roman" w:cs="Times New Roman"/>
+          <w:sz w:val="24"/>
+          <w:szCs w:val="24"/>
+        </w:rPr>
+        <w:t>29</w:t>
       </w:r>
     </w:p>
     <w:p>
@@ -1331,7 +1562,14 @@
           <w:szCs w:val="24"/>
         </w:rPr>
         <w:tab/>
-        <w:t>x</w:t>
+      </w:r>
+      <w:r>
+        <w:rPr>
+          <w:rFonts w:ascii="Times New Roman" w:eastAsia="Times New Roman" w:hAnsi="Times New Roman" w:cs="Times New Roman"/>
+          <w:sz w:val="24"/>
+          <w:szCs w:val="24"/>
+        </w:rPr>
+        <w:t>29</w:t>
       </w:r>
     </w:p>
     <w:p>
@@ -1361,7 +1599,14 @@
           <w:szCs w:val="24"/>
         </w:rPr>
         <w:tab/>
-        <w:t>x</w:t>
+      </w:r>
+      <w:r>
+        <w:rPr>
+          <w:rFonts w:ascii="Times New Roman" w:eastAsia="Times New Roman" w:hAnsi="Times New Roman" w:cs="Times New Roman"/>
+          <w:sz w:val="24"/>
+          <w:szCs w:val="24"/>
+        </w:rPr>
+        <w:t>30</w:t>
       </w:r>
     </w:p>
     <w:p>
@@ -1391,7 +1636,14 @@
           <w:szCs w:val="24"/>
         </w:rPr>
         <w:tab/>
-        <w:t>x</w:t>
+      </w:r>
+      <w:r>
+        <w:rPr>
+          <w:rFonts w:ascii="Times New Roman" w:eastAsia="Times New Roman" w:hAnsi="Times New Roman" w:cs="Times New Roman"/>
+          <w:sz w:val="24"/>
+          <w:szCs w:val="24"/>
+        </w:rPr>
+        <w:t>30</w:t>
       </w:r>
     </w:p>
     <w:p>
@@ -1421,7 +1673,14 @@
           <w:szCs w:val="24"/>
         </w:rPr>
         <w:tab/>
-        <w:t>x</w:t>
+      </w:r>
+      <w:r>
+        <w:rPr>
+          <w:rFonts w:ascii="Times New Roman" w:eastAsia="Times New Roman" w:hAnsi="Times New Roman" w:cs="Times New Roman"/>
+          <w:sz w:val="24"/>
+          <w:szCs w:val="24"/>
+        </w:rPr>
+        <w:t>30</w:t>
       </w:r>
     </w:p>
     <w:p>
@@ -1442,7 +1701,15 @@
           <w:sz w:val="24"/>
           <w:szCs w:val="24"/>
         </w:rPr>
-        <w:t>3.4. Tecnologías del frontend</w:t>
+        <w:t xml:space="preserve">3.4. </w:t>
+      </w:r>
+      <w:r>
+        <w:rPr>
+          <w:rFonts w:ascii="Times New Roman" w:eastAsia="Times New Roman" w:hAnsi="Times New Roman" w:cs="Times New Roman"/>
+          <w:sz w:val="24"/>
+          <w:szCs w:val="24"/>
+        </w:rPr>
+        <w:t>Herramientas de desarrollo</w:t>
       </w:r>
       <w:r>
         <w:rPr>
@@ -1451,7 +1718,14 @@
           <w:szCs w:val="24"/>
         </w:rPr>
         <w:tab/>
-        <w:t>x</w:t>
+      </w:r>
+      <w:r>
+        <w:rPr>
+          <w:rFonts w:ascii="Times New Roman" w:eastAsia="Times New Roman" w:hAnsi="Times New Roman" w:cs="Times New Roman"/>
+          <w:sz w:val="24"/>
+          <w:szCs w:val="24"/>
+        </w:rPr>
+        <w:t>31</w:t>
       </w:r>
     </w:p>
     <w:p>
@@ -1482,7 +1756,14 @@
           <w:szCs w:val="24"/>
         </w:rPr>
         <w:tab/>
-        <w:t>x</w:t>
+      </w:r>
+      <w:r>
+        <w:rPr>
+          <w:rFonts w:ascii="Times New Roman" w:eastAsia="Times New Roman" w:hAnsi="Times New Roman" w:cs="Times New Roman"/>
+          <w:sz w:val="24"/>
+          <w:szCs w:val="24"/>
+        </w:rPr>
+        <w:t>31</w:t>
       </w:r>
     </w:p>
     <w:p>
@@ -1512,7 +1793,14 @@
           <w:szCs w:val="24"/>
         </w:rPr>
         <w:tab/>
-        <w:t>x</w:t>
+      </w:r>
+      <w:r>
+        <w:rPr>
+          <w:rFonts w:ascii="Times New Roman" w:eastAsia="Times New Roman" w:hAnsi="Times New Roman" w:cs="Times New Roman"/>
+          <w:sz w:val="24"/>
+          <w:szCs w:val="24"/>
+        </w:rPr>
+        <w:t>31</w:t>
       </w:r>
     </w:p>
     <w:p>
@@ -1542,7 +1830,14 @@
           <w:szCs w:val="24"/>
         </w:rPr>
         <w:tab/>
-        <w:t>x</w:t>
+      </w:r>
+      <w:r>
+        <w:rPr>
+          <w:rFonts w:ascii="Times New Roman" w:eastAsia="Times New Roman" w:hAnsi="Times New Roman" w:cs="Times New Roman"/>
+          <w:sz w:val="24"/>
+          <w:szCs w:val="24"/>
+        </w:rPr>
+        <w:t>32</w:t>
       </w:r>
     </w:p>
     <w:p>
@@ -1572,7 +1867,14 @@
           <w:szCs w:val="24"/>
         </w:rPr>
         <w:tab/>
-        <w:t>x</w:t>
+      </w:r>
+      <w:r>
+        <w:rPr>
+          <w:rFonts w:ascii="Times New Roman" w:eastAsia="Times New Roman" w:hAnsi="Times New Roman" w:cs="Times New Roman"/>
+          <w:sz w:val="24"/>
+          <w:szCs w:val="24"/>
+        </w:rPr>
+        <w:t>32</w:t>
       </w:r>
     </w:p>
     <w:p>
@@ -1593,7 +1895,15 @@
           <w:sz w:val="24"/>
           <w:szCs w:val="24"/>
         </w:rPr>
-        <w:t>3.5. Tecnologías del frontend</w:t>
+        <w:t xml:space="preserve">3.5. </w:t>
+      </w:r>
+      <w:r>
+        <w:rPr>
+          <w:rFonts w:ascii="Times New Roman" w:eastAsia="Times New Roman" w:hAnsi="Times New Roman" w:cs="Times New Roman"/>
+          <w:sz w:val="24"/>
+          <w:szCs w:val="24"/>
+        </w:rPr>
+        <w:t>Despliegue</w:t>
       </w:r>
       <w:r>
         <w:rPr>
@@ -1602,7 +1912,14 @@
           <w:szCs w:val="24"/>
         </w:rPr>
         <w:tab/>
-        <w:t>x</w:t>
+      </w:r>
+      <w:r>
+        <w:rPr>
+          <w:rFonts w:ascii="Times New Roman" w:eastAsia="Times New Roman" w:hAnsi="Times New Roman" w:cs="Times New Roman"/>
+          <w:sz w:val="24"/>
+          <w:szCs w:val="24"/>
+        </w:rPr>
+        <w:t>32</w:t>
       </w:r>
     </w:p>
     <w:p>
@@ -1632,7 +1949,14 @@
           <w:szCs w:val="24"/>
         </w:rPr>
         <w:tab/>
-        <w:t>x</w:t>
+      </w:r>
+      <w:r>
+        <w:rPr>
+          <w:rFonts w:ascii="Times New Roman" w:eastAsia="Times New Roman" w:hAnsi="Times New Roman" w:cs="Times New Roman"/>
+          <w:sz w:val="24"/>
+          <w:szCs w:val="24"/>
+        </w:rPr>
+        <w:t>33</w:t>
       </w:r>
     </w:p>
     <w:p>
@@ -1662,7 +1986,14 @@
           <w:szCs w:val="24"/>
         </w:rPr>
         <w:tab/>
-        <w:t>x</w:t>
+      </w:r>
+      <w:r>
+        <w:rPr>
+          <w:rFonts w:ascii="Times New Roman" w:eastAsia="Times New Roman" w:hAnsi="Times New Roman" w:cs="Times New Roman"/>
+          <w:sz w:val="24"/>
+          <w:szCs w:val="24"/>
+        </w:rPr>
+        <w:t>33</w:t>
       </w:r>
     </w:p>
     <w:p>
@@ -1705,7 +2036,14 @@
           <w:szCs w:val="24"/>
         </w:rPr>
         <w:tab/>
-        <w:t>x</w:t>
+      </w:r>
+      <w:r>
+        <w:rPr>
+          <w:rFonts w:ascii="Times New Roman" w:eastAsia="Times New Roman" w:hAnsi="Times New Roman" w:cs="Times New Roman"/>
+          <w:sz w:val="24"/>
+          <w:szCs w:val="24"/>
+        </w:rPr>
+        <w:t>34</w:t>
       </w:r>
     </w:p>
     <w:p>
@@ -1735,7 +2073,14 @@
           <w:szCs w:val="24"/>
         </w:rPr>
         <w:tab/>
-        <w:t>x</w:t>
+      </w:r>
+      <w:r>
+        <w:rPr>
+          <w:rFonts w:ascii="Times New Roman" w:eastAsia="Times New Roman" w:hAnsi="Times New Roman" w:cs="Times New Roman"/>
+          <w:sz w:val="24"/>
+          <w:szCs w:val="24"/>
+        </w:rPr>
+        <w:t>34</w:t>
       </w:r>
     </w:p>
     <w:p>
@@ -1765,7 +2110,14 @@
           <w:szCs w:val="24"/>
         </w:rPr>
         <w:tab/>
-        <w:t>x</w:t>
+      </w:r>
+      <w:r>
+        <w:rPr>
+          <w:rFonts w:ascii="Times New Roman" w:eastAsia="Times New Roman" w:hAnsi="Times New Roman" w:cs="Times New Roman"/>
+          <w:sz w:val="24"/>
+          <w:szCs w:val="24"/>
+        </w:rPr>
+        <w:t>35</w:t>
       </w:r>
     </w:p>
     <w:p>
@@ -1795,7 +2147,14 @@
           <w:szCs w:val="24"/>
         </w:rPr>
         <w:tab/>
-        <w:t>x</w:t>
+      </w:r>
+      <w:r>
+        <w:rPr>
+          <w:rFonts w:ascii="Times New Roman" w:eastAsia="Times New Roman" w:hAnsi="Times New Roman" w:cs="Times New Roman"/>
+          <w:sz w:val="24"/>
+          <w:szCs w:val="24"/>
+        </w:rPr>
+        <w:t>35</w:t>
       </w:r>
     </w:p>
     <w:p>
@@ -1825,7 +2184,14 @@
           <w:szCs w:val="24"/>
         </w:rPr>
         <w:tab/>
-        <w:t>x</w:t>
+      </w:r>
+      <w:r>
+        <w:rPr>
+          <w:rFonts w:ascii="Times New Roman" w:eastAsia="Times New Roman" w:hAnsi="Times New Roman" w:cs="Times New Roman"/>
+          <w:sz w:val="24"/>
+          <w:szCs w:val="24"/>
+        </w:rPr>
+        <w:t>36</w:t>
       </w:r>
     </w:p>
     <w:p>
@@ -1855,7 +2221,14 @@
           <w:szCs w:val="24"/>
         </w:rPr>
         <w:tab/>
-        <w:t>x</w:t>
+      </w:r>
+      <w:r>
+        <w:rPr>
+          <w:rFonts w:ascii="Times New Roman" w:eastAsia="Times New Roman" w:hAnsi="Times New Roman" w:cs="Times New Roman"/>
+          <w:sz w:val="24"/>
+          <w:szCs w:val="24"/>
+        </w:rPr>
+        <w:t>36</w:t>
       </w:r>
     </w:p>
     <w:p>
@@ -1885,7 +2258,14 @@
           <w:szCs w:val="24"/>
         </w:rPr>
         <w:tab/>
-        <w:t>x</w:t>
+      </w:r>
+      <w:r>
+        <w:rPr>
+          <w:rFonts w:ascii="Times New Roman" w:eastAsia="Times New Roman" w:hAnsi="Times New Roman" w:cs="Times New Roman"/>
+          <w:sz w:val="24"/>
+          <w:szCs w:val="24"/>
+        </w:rPr>
+        <w:t>37</w:t>
       </w:r>
     </w:p>
     <w:p>
@@ -1915,7 +2295,14 @@
           <w:szCs w:val="24"/>
         </w:rPr>
         <w:tab/>
-        <w:t>x</w:t>
+      </w:r>
+      <w:r>
+        <w:rPr>
+          <w:rFonts w:ascii="Times New Roman" w:eastAsia="Times New Roman" w:hAnsi="Times New Roman" w:cs="Times New Roman"/>
+          <w:sz w:val="24"/>
+          <w:szCs w:val="24"/>
+        </w:rPr>
+        <w:t>41</w:t>
       </w:r>
     </w:p>
     <w:p>
@@ -1945,7 +2332,14 @@
           <w:szCs w:val="24"/>
         </w:rPr>
         <w:tab/>
-        <w:t>x</w:t>
+      </w:r>
+      <w:r>
+        <w:rPr>
+          <w:rFonts w:ascii="Times New Roman" w:eastAsia="Times New Roman" w:hAnsi="Times New Roman" w:cs="Times New Roman"/>
+          <w:sz w:val="24"/>
+          <w:szCs w:val="24"/>
+        </w:rPr>
+        <w:t>42</w:t>
       </w:r>
     </w:p>
     <w:p>
@@ -1983,7 +2377,14 @@
           <w:szCs w:val="24"/>
         </w:rPr>
         <w:tab/>
-        <w:t>x</w:t>
+      </w:r>
+      <w:r>
+        <w:rPr>
+          <w:rFonts w:ascii="Times New Roman" w:eastAsia="Times New Roman" w:hAnsi="Times New Roman" w:cs="Times New Roman"/>
+          <w:sz w:val="24"/>
+          <w:szCs w:val="24"/>
+        </w:rPr>
+        <w:t>45</w:t>
       </w:r>
     </w:p>
     <w:p>
@@ -2021,7 +2422,14 @@
           <w:szCs w:val="24"/>
         </w:rPr>
         <w:tab/>
-        <w:t>x</w:t>
+      </w:r>
+      <w:r>
+        <w:rPr>
+          <w:rFonts w:ascii="Times New Roman" w:eastAsia="Times New Roman" w:hAnsi="Times New Roman" w:cs="Times New Roman"/>
+          <w:sz w:val="24"/>
+          <w:szCs w:val="24"/>
+        </w:rPr>
+        <w:t>45</w:t>
       </w:r>
     </w:p>
     <w:p>
@@ -2059,7 +2467,14 @@
           <w:szCs w:val="24"/>
         </w:rPr>
         <w:tab/>
-        <w:t>x</w:t>
+      </w:r>
+      <w:r>
+        <w:rPr>
+          <w:rFonts w:ascii="Times New Roman" w:eastAsia="Times New Roman" w:hAnsi="Times New Roman" w:cs="Times New Roman"/>
+          <w:sz w:val="24"/>
+          <w:szCs w:val="24"/>
+        </w:rPr>
+        <w:t>47</w:t>
       </w:r>
     </w:p>
     <w:p>
@@ -2097,7 +2512,14 @@
           <w:szCs w:val="24"/>
         </w:rPr>
         <w:tab/>
-        <w:t>x</w:t>
+      </w:r>
+      <w:r>
+        <w:rPr>
+          <w:rFonts w:ascii="Times New Roman" w:eastAsia="Times New Roman" w:hAnsi="Times New Roman" w:cs="Times New Roman"/>
+          <w:sz w:val="24"/>
+          <w:szCs w:val="24"/>
+        </w:rPr>
+        <w:t>48</w:t>
       </w:r>
     </w:p>
     <w:p>
@@ -2135,7 +2557,14 @@
           <w:szCs w:val="24"/>
         </w:rPr>
         <w:tab/>
-        <w:t>x</w:t>
+      </w:r>
+      <w:r>
+        <w:rPr>
+          <w:rFonts w:ascii="Times New Roman" w:eastAsia="Times New Roman" w:hAnsi="Times New Roman" w:cs="Times New Roman"/>
+          <w:sz w:val="24"/>
+          <w:szCs w:val="24"/>
+        </w:rPr>
+        <w:t>49</w:t>
       </w:r>
     </w:p>
     <w:p>
@@ -2156,15 +2585,31 @@
           <w:sz w:val="24"/>
           <w:szCs w:val="24"/>
         </w:rPr>
-        <w:t xml:space="preserve">4.4. </w:t>
-      </w:r>
-      <w:r>
-        <w:rPr>
-          <w:rFonts w:ascii="Times New Roman" w:eastAsia="Times New Roman" w:hAnsi="Times New Roman" w:cs="Times New Roman"/>
-          <w:sz w:val="24"/>
-          <w:szCs w:val="24"/>
-        </w:rPr>
-        <w:t>Implementación</w:t>
+        <w:t>4.3.</w:t>
+      </w:r>
+      <w:r>
+        <w:rPr>
+          <w:rFonts w:ascii="Times New Roman" w:eastAsia="Times New Roman" w:hAnsi="Times New Roman" w:cs="Times New Roman"/>
+          <w:sz w:val="24"/>
+          <w:szCs w:val="24"/>
+        </w:rPr>
+        <w:t>5</w:t>
+      </w:r>
+      <w:r>
+        <w:rPr>
+          <w:rFonts w:ascii="Times New Roman" w:eastAsia="Times New Roman" w:hAnsi="Times New Roman" w:cs="Times New Roman"/>
+          <w:sz w:val="24"/>
+          <w:szCs w:val="24"/>
+        </w:rPr>
+        <w:t xml:space="preserve">. Diagrama de </w:t>
+      </w:r>
+      <w:r>
+        <w:rPr>
+          <w:rFonts w:ascii="Times New Roman" w:eastAsia="Times New Roman" w:hAnsi="Times New Roman" w:cs="Times New Roman"/>
+          <w:sz w:val="24"/>
+          <w:szCs w:val="24"/>
+        </w:rPr>
+        <w:t>actividad</w:t>
       </w:r>
       <w:r>
         <w:rPr>
@@ -2173,7 +2618,14 @@
           <w:szCs w:val="24"/>
         </w:rPr>
         <w:tab/>
-        <w:t>x</w:t>
+      </w:r>
+      <w:r>
+        <w:rPr>
+          <w:rFonts w:ascii="Times New Roman" w:eastAsia="Times New Roman" w:hAnsi="Times New Roman" w:cs="Times New Roman"/>
+          <w:sz w:val="24"/>
+          <w:szCs w:val="24"/>
+        </w:rPr>
+        <w:t>50</w:t>
       </w:r>
     </w:p>
     <w:p>
@@ -2194,15 +2646,15 @@
           <w:sz w:val="24"/>
           <w:szCs w:val="24"/>
         </w:rPr>
-        <w:t xml:space="preserve">4.4.1. </w:t>
-      </w:r>
-      <w:r>
-        <w:rPr>
-          <w:rFonts w:ascii="Times New Roman" w:eastAsia="Times New Roman" w:hAnsi="Times New Roman" w:cs="Times New Roman"/>
-          <w:sz w:val="24"/>
-          <w:szCs w:val="24"/>
-        </w:rPr>
-        <w:t>Interfaz de la aplicación</w:t>
+        <w:t xml:space="preserve">4.4. </w:t>
+      </w:r>
+      <w:r>
+        <w:rPr>
+          <w:rFonts w:ascii="Times New Roman" w:eastAsia="Times New Roman" w:hAnsi="Times New Roman" w:cs="Times New Roman"/>
+          <w:sz w:val="24"/>
+          <w:szCs w:val="24"/>
+        </w:rPr>
+        <w:t>Implementación</w:t>
       </w:r>
       <w:r>
         <w:rPr>
@@ -2211,7 +2663,14 @@
           <w:szCs w:val="24"/>
         </w:rPr>
         <w:tab/>
-        <w:t>x</w:t>
+      </w:r>
+      <w:r>
+        <w:rPr>
+          <w:rFonts w:ascii="Times New Roman" w:eastAsia="Times New Roman" w:hAnsi="Times New Roman" w:cs="Times New Roman"/>
+          <w:sz w:val="24"/>
+          <w:szCs w:val="24"/>
+        </w:rPr>
+        <w:t>52</w:t>
       </w:r>
     </w:p>
     <w:p>
@@ -2232,15 +2691,15 @@
           <w:sz w:val="24"/>
           <w:szCs w:val="24"/>
         </w:rPr>
-        <w:t xml:space="preserve">4.4.2. </w:t>
-      </w:r>
-      <w:r>
-        <w:rPr>
-          <w:rFonts w:ascii="Times New Roman" w:eastAsia="Times New Roman" w:hAnsi="Times New Roman" w:cs="Times New Roman"/>
-          <w:sz w:val="24"/>
-          <w:szCs w:val="24"/>
-        </w:rPr>
-        <w:t>Problemas técnicos resueltos</w:t>
+        <w:t xml:space="preserve">4.4.1. </w:t>
+      </w:r>
+      <w:r>
+        <w:rPr>
+          <w:rFonts w:ascii="Times New Roman" w:eastAsia="Times New Roman" w:hAnsi="Times New Roman" w:cs="Times New Roman"/>
+          <w:sz w:val="24"/>
+          <w:szCs w:val="24"/>
+        </w:rPr>
+        <w:t>Interfaz de la aplicación</w:t>
       </w:r>
       <w:r>
         <w:rPr>
@@ -2249,7 +2708,14 @@
           <w:szCs w:val="24"/>
         </w:rPr>
         <w:tab/>
-        <w:t>x</w:t>
+      </w:r>
+      <w:r>
+        <w:rPr>
+          <w:rFonts w:ascii="Times New Roman" w:eastAsia="Times New Roman" w:hAnsi="Times New Roman" w:cs="Times New Roman"/>
+          <w:sz w:val="24"/>
+          <w:szCs w:val="24"/>
+        </w:rPr>
+        <w:t>52</w:t>
       </w:r>
     </w:p>
     <w:p>
@@ -2270,15 +2736,15 @@
           <w:sz w:val="24"/>
           <w:szCs w:val="24"/>
         </w:rPr>
-        <w:t xml:space="preserve">4.5. </w:t>
-      </w:r>
-      <w:r>
-        <w:rPr>
-          <w:rFonts w:ascii="Times New Roman" w:eastAsia="Times New Roman" w:hAnsi="Times New Roman" w:cs="Times New Roman"/>
-          <w:sz w:val="24"/>
-          <w:szCs w:val="24"/>
-        </w:rPr>
-        <w:t>Pruebas e implantación</w:t>
+        <w:t xml:space="preserve">4.4.2. </w:t>
+      </w:r>
+      <w:r>
+        <w:rPr>
+          <w:rFonts w:ascii="Times New Roman" w:eastAsia="Times New Roman" w:hAnsi="Times New Roman" w:cs="Times New Roman"/>
+          <w:sz w:val="24"/>
+          <w:szCs w:val="24"/>
+        </w:rPr>
+        <w:t>Problemas técnicos resueltos</w:t>
       </w:r>
       <w:r>
         <w:rPr>
@@ -2287,7 +2753,14 @@
           <w:szCs w:val="24"/>
         </w:rPr>
         <w:tab/>
-        <w:t>x</w:t>
+      </w:r>
+      <w:r>
+        <w:rPr>
+          <w:rFonts w:ascii="Times New Roman" w:eastAsia="Times New Roman" w:hAnsi="Times New Roman" w:cs="Times New Roman"/>
+          <w:sz w:val="24"/>
+          <w:szCs w:val="24"/>
+        </w:rPr>
+        <w:t>61</w:t>
       </w:r>
     </w:p>
     <w:p>
@@ -2302,6 +2775,38 @@
           <w:szCs w:val="24"/>
         </w:rPr>
       </w:pPr>
+      <w:r>
+        <w:rPr>
+          <w:rFonts w:ascii="Times New Roman" w:eastAsia="Times New Roman" w:hAnsi="Times New Roman" w:cs="Times New Roman"/>
+          <w:sz w:val="24"/>
+          <w:szCs w:val="24"/>
+        </w:rPr>
+        <w:t xml:space="preserve">4.5. </w:t>
+      </w:r>
+      <w:r>
+        <w:rPr>
+          <w:rFonts w:ascii="Times New Roman" w:eastAsia="Times New Roman" w:hAnsi="Times New Roman" w:cs="Times New Roman"/>
+          <w:sz w:val="24"/>
+          <w:szCs w:val="24"/>
+        </w:rPr>
+        <w:t>Pruebas e implantación</w:t>
+      </w:r>
+      <w:r>
+        <w:rPr>
+          <w:rFonts w:ascii="Times New Roman" w:eastAsia="Times New Roman" w:hAnsi="Times New Roman" w:cs="Times New Roman"/>
+          <w:sz w:val="24"/>
+          <w:szCs w:val="24"/>
+        </w:rPr>
+        <w:tab/>
+      </w:r>
+      <w:r>
+        <w:rPr>
+          <w:rFonts w:ascii="Times New Roman" w:eastAsia="Times New Roman" w:hAnsi="Times New Roman" w:cs="Times New Roman"/>
+          <w:sz w:val="24"/>
+          <w:szCs w:val="24"/>
+        </w:rPr>
+        <w:t>63</w:t>
+      </w:r>
     </w:p>
     <w:p>
       <w:pPr>
@@ -2315,23 +2820,6 @@
           <w:szCs w:val="24"/>
         </w:rPr>
       </w:pPr>
-      <w:r>
-        <w:rPr>
-          <w:rFonts w:ascii="Times New Roman" w:eastAsia="Times New Roman" w:hAnsi="Times New Roman" w:cs="Times New Roman"/>
-          <w:sz w:val="24"/>
-          <w:szCs w:val="24"/>
-        </w:rPr>
-        <w:t>5. Conclusiones y trabajo futuro</w:t>
-      </w:r>
-      <w:r>
-        <w:rPr>
-          <w:rFonts w:ascii="Times New Roman" w:eastAsia="Times New Roman" w:hAnsi="Times New Roman" w:cs="Times New Roman"/>
-          <w:sz w:val="24"/>
-          <w:szCs w:val="24"/>
-        </w:rPr>
-        <w:tab/>
-        <w:t>x</w:t>
-      </w:r>
     </w:p>
     <w:p>
       <w:pPr>
@@ -2351,7 +2839,7 @@
           <w:sz w:val="24"/>
           <w:szCs w:val="24"/>
         </w:rPr>
-        <w:t>5.1. Conclusiones</w:t>
+        <w:t>5. Conclusiones y trabajo futuro</w:t>
       </w:r>
       <w:r>
         <w:rPr>
@@ -2360,7 +2848,14 @@
           <w:szCs w:val="24"/>
         </w:rPr>
         <w:tab/>
-        <w:t>x</w:t>
+      </w:r>
+      <w:r>
+        <w:rPr>
+          <w:rFonts w:ascii="Times New Roman" w:eastAsia="Times New Roman" w:hAnsi="Times New Roman" w:cs="Times New Roman"/>
+          <w:sz w:val="24"/>
+          <w:szCs w:val="24"/>
+        </w:rPr>
+        <w:t>66</w:t>
       </w:r>
     </w:p>
     <w:p>
@@ -2381,7 +2876,7 @@
           <w:sz w:val="24"/>
           <w:szCs w:val="24"/>
         </w:rPr>
-        <w:t>5.2. Posibles desarrollos futuros</w:t>
+        <w:t>5.1. Conclusiones</w:t>
       </w:r>
       <w:r>
         <w:rPr>
@@ -2390,7 +2885,14 @@
           <w:szCs w:val="24"/>
         </w:rPr>
         <w:tab/>
-        <w:t>x</w:t>
+      </w:r>
+      <w:r>
+        <w:rPr>
+          <w:rFonts w:ascii="Times New Roman" w:eastAsia="Times New Roman" w:hAnsi="Times New Roman" w:cs="Times New Roman"/>
+          <w:sz w:val="24"/>
+          <w:szCs w:val="24"/>
+        </w:rPr>
+        <w:t>66</w:t>
       </w:r>
     </w:p>
     <w:p>
@@ -2405,6 +2907,30 @@
           <w:szCs w:val="24"/>
         </w:rPr>
       </w:pPr>
+      <w:r>
+        <w:rPr>
+          <w:rFonts w:ascii="Times New Roman" w:eastAsia="Times New Roman" w:hAnsi="Times New Roman" w:cs="Times New Roman"/>
+          <w:sz w:val="24"/>
+          <w:szCs w:val="24"/>
+        </w:rPr>
+        <w:t>5.2. Posibles desarrollos futuros</w:t>
+      </w:r>
+      <w:r>
+        <w:rPr>
+          <w:rFonts w:ascii="Times New Roman" w:eastAsia="Times New Roman" w:hAnsi="Times New Roman" w:cs="Times New Roman"/>
+          <w:sz w:val="24"/>
+          <w:szCs w:val="24"/>
+        </w:rPr>
+        <w:tab/>
+      </w:r>
+      <w:r>
+        <w:rPr>
+          <w:rFonts w:ascii="Times New Roman" w:eastAsia="Times New Roman" w:hAnsi="Times New Roman" w:cs="Times New Roman"/>
+          <w:sz w:val="24"/>
+          <w:szCs w:val="24"/>
+        </w:rPr>
+        <w:t>67</w:t>
+      </w:r>
     </w:p>
     <w:p>
       <w:pPr>
@@ -2418,13 +2944,34 @@
           <w:szCs w:val="24"/>
         </w:rPr>
       </w:pPr>
-      <w:r>
-        <w:rPr>
-          <w:rFonts w:ascii="Times New Roman" w:eastAsia="Times New Roman" w:hAnsi="Times New Roman" w:cs="Times New Roman"/>
-          <w:sz w:val="24"/>
-          <w:szCs w:val="24"/>
-        </w:rPr>
-        <w:t>6. Conclusiones y trabajo futuro</w:t>
+    </w:p>
+    <w:p>
+      <w:pPr>
+        <w:tabs>
+          <w:tab w:val="right" w:pos="8775"/>
+        </w:tabs>
+        <w:jc w:val="both"/>
+        <w:rPr>
+          <w:rFonts w:ascii="Times New Roman" w:eastAsia="Times New Roman" w:hAnsi="Times New Roman" w:cs="Times New Roman"/>
+          <w:sz w:val="24"/>
+          <w:szCs w:val="24"/>
+        </w:rPr>
+      </w:pPr>
+      <w:r>
+        <w:rPr>
+          <w:rFonts w:ascii="Times New Roman" w:eastAsia="Times New Roman" w:hAnsi="Times New Roman" w:cs="Times New Roman"/>
+          <w:sz w:val="24"/>
+          <w:szCs w:val="24"/>
+        </w:rPr>
+        <w:t xml:space="preserve">6. </w:t>
+      </w:r>
+      <w:r>
+        <w:rPr>
+          <w:rFonts w:ascii="Times New Roman" w:eastAsia="Times New Roman" w:hAnsi="Times New Roman" w:cs="Times New Roman"/>
+          <w:sz w:val="24"/>
+          <w:szCs w:val="24"/>
+        </w:rPr>
+        <w:t>Bibliografía</w:t>
       </w:r>
       <w:r>
         <w:rPr>
@@ -2433,7 +2980,14 @@
           <w:szCs w:val="24"/>
         </w:rPr>
         <w:tab/>
-        <w:t>x</w:t>
+      </w:r>
+      <w:r>
+        <w:rPr>
+          <w:rFonts w:ascii="Times New Roman" w:eastAsia="Times New Roman" w:hAnsi="Times New Roman" w:cs="Times New Roman"/>
+          <w:sz w:val="24"/>
+          <w:szCs w:val="24"/>
+        </w:rPr>
+        <w:t>70</w:t>
       </w:r>
     </w:p>
     <w:p>

</xml_diff>

<commit_message>
Capitulos unidos updated with references to the bibliography
</commit_message>
<xml_diff>
--- a/docs/Capitulos unidos.docx
+++ b/docs/Capitulos unidos.docx
@@ -6405,7 +6405,31 @@
           <w:sz w:val="24"/>
           <w:szCs w:val="24"/>
         </w:rPr>
-        <w:t>Según el informe Facts &amp; Figures 2025 de FEDIAF (Federación Europea de la Industria de Alimentos para Animales de Compañía), la población total de mascotas en España alcanza los 24,2 millones de ejemplares, con datos de 2023. El mismo informe revela que un 27% de los hogares españoles convive con al menos un perro y un 17% con al menos un gato, lo que sitúa a España entre los países europeos con mayor presencia de animales de compañía</w:t>
+        <w:t>Según el informe Facts &amp; Figures 2025 de FEDIAF (Federación Europea de la Industria de Alimentos para Animales de Compañía), la población total de mascotas en España alcanza los 24,2 millones de ejemplares, con datos de 2023</w:t>
+      </w:r>
+      <w:r>
+        <w:rPr>
+          <w:rFonts w:ascii="Times New Roman" w:eastAsia="Times New Roman" w:hAnsi="Times New Roman" w:cs="Times New Roman"/>
+          <w:sz w:val="24"/>
+          <w:szCs w:val="24"/>
+        </w:rPr>
+        <w:t xml:space="preserve"> [1]</w:t>
+      </w:r>
+      <w:r>
+        <w:rPr>
+          <w:rFonts w:ascii="Times New Roman" w:eastAsia="Times New Roman" w:hAnsi="Times New Roman" w:cs="Times New Roman"/>
+          <w:sz w:val="24"/>
+          <w:szCs w:val="24"/>
+        </w:rPr>
+        <w:t>. El mismo informe revela que un 27% de los hogares españoles convive con al menos un perro y un 17% con al menos un gato, lo que sitúa a España entre los países europeos con mayor presencia de animales de compañía</w:t>
+      </w:r>
+      <w:r>
+        <w:rPr>
+          <w:rFonts w:ascii="Times New Roman" w:eastAsia="Times New Roman" w:hAnsi="Times New Roman" w:cs="Times New Roman"/>
+          <w:sz w:val="24"/>
+          <w:szCs w:val="24"/>
+        </w:rPr>
+        <w:t xml:space="preserve"> [1]</w:t>
       </w:r>
       <w:r>
         <w:rPr>
@@ -9152,7 +9176,23 @@
           <w:sz w:val="24"/>
           <w:szCs w:val="24"/>
         </w:rPr>
-        <w:t>PetDesk es una plataforma orientada a la gestión de la salud animal y a la comunicación entre propietarios de mascotas y sus proveedores de cuidado, como clínicas veterinarias, peluquerías o residencias caninas. Está disponible para iOS y Android, y cuenta además con una versión de escritorio destinada principalmente a los profesionales del sector. Su modelo de negocio es de tipo B2B: la aplicación es gratuita para el usuario final, mientras que las clínicas veterinarias abonan una suscripción mensual para integrarse en la plataforma. Cabe destacar que se trata de una herramienta orientada principalmente al mercado anglosajón, lo que puede limitar su adopción en el contexto español.</w:t>
+        <w:t>PetDesk es una plataforma orientada a la gestión de la salud animal y a la comunicación entre propietarios de mascotas y sus proveedores de cuidado, como clínicas veterinarias, peluquerías o residencias caninas</w:t>
+      </w:r>
+      <w:r>
+        <w:rPr>
+          <w:rFonts w:ascii="Times New Roman" w:eastAsia="Times New Roman" w:hAnsi="Times New Roman" w:cs="Times New Roman"/>
+          <w:sz w:val="24"/>
+          <w:szCs w:val="24"/>
+        </w:rPr>
+        <w:t xml:space="preserve"> [3]</w:t>
+      </w:r>
+      <w:r>
+        <w:rPr>
+          <w:rFonts w:ascii="Times New Roman" w:eastAsia="Times New Roman" w:hAnsi="Times New Roman" w:cs="Times New Roman"/>
+          <w:sz w:val="24"/>
+          <w:szCs w:val="24"/>
+        </w:rPr>
+        <w:t>. Está disponible para iOS y Android, y cuenta además con una versión de escritorio destinada principalmente a los profesionales del sector. Su modelo de negocio es de tipo B2B: la aplicación es gratuita para el usuario final, mientras que las clínicas veterinarias abonan una suscripción mensual para integrarse en la plataforma. Cabe destacar que se trata de una herramienta orientada principalmente al mercado anglosajón, lo que puede limitar su adopción en el contexto español.</w:t>
       </w:r>
     </w:p>
     <w:p>
@@ -9787,7 +9827,23 @@
           <w:sz w:val="24"/>
           <w:szCs w:val="24"/>
         </w:rPr>
-        <w:t>11pets es una plataforma integral de gestión del cuidado de mascotas orientada al propietario. A diferencia de PetDesk, 11pets pone el control en manos del dueño, permitiendo llevar un registro exhaustivo de todo lo relacionado con el animal, desde su salud hasta su higiene y los gastos asociados, sin depender de que el veterinario esté integrado en la plataforma. Está disponible para iOS y Android, y cuenta además con una versión web que permite consultar y editar los datos desde el ordenador, manteniéndose sincronizada con la aplicación móvil. Su modelo de negocio es freemium: la aplicación es gratuita sin publicidad para el propietario, mientras que los profesionales, como peluquerías, protectoras y residencias disponen de un software de gestión de pago.</w:t>
+        <w:t>11pets es una plataforma integral de gestión del cuidado de mascotas orientada al propietario</w:t>
+      </w:r>
+      <w:r>
+        <w:rPr>
+          <w:rFonts w:ascii="Times New Roman" w:eastAsia="Times New Roman" w:hAnsi="Times New Roman" w:cs="Times New Roman"/>
+          <w:sz w:val="24"/>
+          <w:szCs w:val="24"/>
+        </w:rPr>
+        <w:t xml:space="preserve"> [4]</w:t>
+      </w:r>
+      <w:r>
+        <w:rPr>
+          <w:rFonts w:ascii="Times New Roman" w:eastAsia="Times New Roman" w:hAnsi="Times New Roman" w:cs="Times New Roman"/>
+          <w:sz w:val="24"/>
+          <w:szCs w:val="24"/>
+        </w:rPr>
+        <w:t>. A diferencia de PetDesk, 11pets pone el control en manos del dueño, permitiendo llevar un registro exhaustivo de todo lo relacionado con el animal, desde su salud hasta su higiene y los gastos asociados, sin depender de que el veterinario esté integrado en la plataforma. Está disponible para iOS y Android, y cuenta además con una versión web que permite consultar y editar los datos desde el ordenador, manteniéndose sincronizada con la aplicación móvil. Su modelo de negocio es freemium: la aplicación es gratuita sin publicidad para el propietario, mientras que los profesionales, como peluquerías, protectoras y residencias disponen de un software de gestión de pago.</w:t>
       </w:r>
     </w:p>
     <w:p>
@@ -10678,7 +10734,23 @@
           <w:sz w:val="24"/>
           <w:szCs w:val="24"/>
         </w:rPr>
-        <w:t>Dogo es una plataforma de adiestramiento canino orientada al propietario, disponible para iOS y Android. Cuenta además con una página web donde el usuario puede consultar información general, acceder a un blog y completar el proceso de registro inicial mediante cuestionarios personalizados. La aplicación está diseñada exclusivamente para perros, ya que todos sus programas, ejercicios y contenidos están adaptados a la etología canina. Su modelo de negocio es freemium: la versión gratuita incluye acceso a ejercicios básicos, seguimiento de salud y peso, y el uso del clicker integrado, mientras que las funcionalidades avanzadas, como los programas personalizados completos, la cuenta familiar y el acceso a varios perfiles de perros, requieren una suscripción de pago con un coste de 5,99€/mes o 39,99€/año.</w:t>
+        <w:t>Dogo es una plataforma de adiestramiento canino orientada al propietario, disponible para iOS y Android</w:t>
+      </w:r>
+      <w:r>
+        <w:rPr>
+          <w:rFonts w:ascii="Times New Roman" w:eastAsia="Times New Roman" w:hAnsi="Times New Roman" w:cs="Times New Roman"/>
+          <w:sz w:val="24"/>
+          <w:szCs w:val="24"/>
+        </w:rPr>
+        <w:t xml:space="preserve"> [5]</w:t>
+      </w:r>
+      <w:r>
+        <w:rPr>
+          <w:rFonts w:ascii="Times New Roman" w:eastAsia="Times New Roman" w:hAnsi="Times New Roman" w:cs="Times New Roman"/>
+          <w:sz w:val="24"/>
+          <w:szCs w:val="24"/>
+        </w:rPr>
+        <w:t>. Cuenta además con una página web donde el usuario puede consultar información general, acceder a un blog y completar el proceso de registro inicial mediante cuestionarios personalizados. La aplicación está diseñada exclusivamente para perros, ya que todos sus programas, ejercicios y contenidos están adaptados a la etología canina. Su modelo de negocio es freemium: la versión gratuita incluye acceso a ejercicios básicos, seguimiento de salud y peso, y el uso del clicker integrado, mientras que las funcionalidades avanzadas, como los programas personalizados completos, la cuenta familiar y el acceso a varios perfiles de perros, requieren una suscripción de pago con un coste de 5,99€/mes o 39,99€/año.</w:t>
       </w:r>
     </w:p>
     <w:p>
@@ -11670,7 +11742,23 @@
           <w:sz w:val="24"/>
           <w:szCs w:val="24"/>
         </w:rPr>
-        <w:t>PetnotePlus es una aplicación de registro y seguimiento compartido orientada a la gestión diaria del cuidado de mascotas. Su propósito principal es proporcionar un espacio común donde todos los cuidadores de un animal puedan anotar las acciones realizadas y consultar las pendientes, contribuyendo así a evitar olvidos y duplicidades. A diferencia de las herramientas analizadas anteriormente, PetnotePlus es multiespecie y admite el registro de mamíferos, aves y reptiles. Está disponible para iOS y Android con un modelo de negocio freemium: la versión gratuita incluye anuncios y limita algunas funcionalidades avanzadas, mientras que la versión premium elimina la publicidad, amplía el número de elementos de seguimiento por mascota y desbloquea funciones adicionales como la exportación de datos en formato CSV.</w:t>
+        <w:t>PetnotePlus es una aplicación de registro y seguimiento compartido orientada a la gestión diaria del cuidado de mascotas</w:t>
+      </w:r>
+      <w:r>
+        <w:rPr>
+          <w:rFonts w:ascii="Times New Roman" w:eastAsia="Times New Roman" w:hAnsi="Times New Roman" w:cs="Times New Roman"/>
+          <w:sz w:val="24"/>
+          <w:szCs w:val="24"/>
+        </w:rPr>
+        <w:t xml:space="preserve"> [6]</w:t>
+      </w:r>
+      <w:r>
+        <w:rPr>
+          <w:rFonts w:ascii="Times New Roman" w:eastAsia="Times New Roman" w:hAnsi="Times New Roman" w:cs="Times New Roman"/>
+          <w:sz w:val="24"/>
+          <w:szCs w:val="24"/>
+        </w:rPr>
+        <w:t>. Su propósito principal es proporcionar un espacio común donde todos los cuidadores de un animal puedan anotar las acciones realizadas y consultar las pendientes, contribuyendo así a evitar olvidos y duplicidades. A diferencia de las herramientas analizadas anteriormente, PetnotePlus es multiespecie y admite el registro de mamíferos, aves y reptiles. Está disponible para iOS y Android con un modelo de negocio freemium: la versión gratuita incluye anuncios y limita algunas funcionalidades avanzadas, mientras que la versión premium elimina la publicidad, amplía el número de elementos de seguimiento por mascota y desbloquea funciones adicionales como la exportación de datos en formato CSV.</w:t>
       </w:r>
     </w:p>
     <w:p>
@@ -12548,7 +12636,23 @@
           <w:sz w:val="24"/>
           <w:szCs w:val="24"/>
         </w:rPr>
-        <w:t>VitusVet es una aplicación de gestión de registros de salud y comunicación. Su función principal es permitir que los dueños de mascotas tengan acceso en cualquier momento al historial clínico digital de sus animales y facilitar la coordinación entre los diferentes cuidadores y profesionales. Se trata de una aplicación multiespecie donde se admiten perros, gatos, conejos, aves, reptiles y caballos. Está disponible en iOS y Android, además tiene un portal web para usuarios y clínicas.</w:t>
+        <w:t>VitusVet es una aplicación de gestión de registros de salud y comunicación</w:t>
+      </w:r>
+      <w:r>
+        <w:rPr>
+          <w:rFonts w:ascii="Times New Roman" w:eastAsia="Times New Roman" w:hAnsi="Times New Roman" w:cs="Times New Roman"/>
+          <w:sz w:val="24"/>
+          <w:szCs w:val="24"/>
+        </w:rPr>
+        <w:t xml:space="preserve"> [7]</w:t>
+      </w:r>
+      <w:r>
+        <w:rPr>
+          <w:rFonts w:ascii="Times New Roman" w:eastAsia="Times New Roman" w:hAnsi="Times New Roman" w:cs="Times New Roman"/>
+          <w:sz w:val="24"/>
+          <w:szCs w:val="24"/>
+        </w:rPr>
+        <w:t>. Su función principal es permitir que los dueños de mascotas tengan acceso en cualquier momento al historial clínico digital de sus animales y facilitar la coordinación entre los diferentes cuidadores y profesionales. Se trata de una aplicación multiespecie donde se admiten perros, gatos, conejos, aves, reptiles y caballos. Está disponible en iOS y Android, además tiene un portal web para usuarios y clínicas.</w:t>
       </w:r>
     </w:p>
     <w:p>
@@ -16417,7 +16521,23 @@
           <w:sz w:val="24"/>
           <w:szCs w:val="24"/>
         </w:rPr>
-        <w:t>Spring Boot es un framework de desarrollo de aplicaciones Java que simplifica considerablemente la configuración y el arranque de proyectos basados en el ecosistema Spring. Su principal aportación es la autoconfiguración: a partir de las dependencias incluidas en el proyecto, Spring Boot configura automáticamente los componentes necesarios, eliminando la necesidad de escribir extenso código de configuración manual.</w:t>
+        <w:t>Spring Boot es un framework de desarrollo de aplicaciones Java que simplifica considerablemente la configuración y el arranque de proyectos basados en el ecosistema Spring</w:t>
+      </w:r>
+      <w:r>
+        <w:rPr>
+          <w:rFonts w:ascii="Times New Roman" w:eastAsia="Times New Roman" w:hAnsi="Times New Roman" w:cs="Times New Roman"/>
+          <w:sz w:val="24"/>
+          <w:szCs w:val="24"/>
+        </w:rPr>
+        <w:t xml:space="preserve"> [8]</w:t>
+      </w:r>
+      <w:r>
+        <w:rPr>
+          <w:rFonts w:ascii="Times New Roman" w:eastAsia="Times New Roman" w:hAnsi="Times New Roman" w:cs="Times New Roman"/>
+          <w:sz w:val="24"/>
+          <w:szCs w:val="24"/>
+        </w:rPr>
+        <w:t>. Su principal aportación es la autoconfiguración: a partir de las dependencias incluidas en el proyecto, Spring Boot configura automáticamente los componentes necesarios, eliminando la necesidad de escribir extenso código de configuración manual.</w:t>
       </w:r>
     </w:p>
     <w:p>
@@ -16627,7 +16747,23 @@
           <w:sz w:val="24"/>
           <w:szCs w:val="24"/>
         </w:rPr>
-        <w:t>JPA (Java Persistence API) es el estándar de la plataforma Java para el mapeo objeto-relacional (ORM), es decir, para la traducción automática entre los objetos del modelo de dominio y las tablas de la base de datos relacional. Hibernate es la implementación de referencia de este estándar y la que Spring Boot utiliza por defecto a través del módulo Spring Data JPA.</w:t>
+        <w:t>JPA (Java Persistence API) es el estándar de la plataforma Java para el mapeo objeto-relacional (ORM), es decir, para la traducción automática entre los objetos del modelo de dominio y las tablas de la base de datos relacional. Hibernate es la implementación de referencia de este estándar y la que Spring Boot utiliza por defecto a través del módulo Spring Data JPA</w:t>
+      </w:r>
+      <w:r>
+        <w:rPr>
+          <w:rFonts w:ascii="Times New Roman" w:eastAsia="Times New Roman" w:hAnsi="Times New Roman" w:cs="Times New Roman"/>
+          <w:sz w:val="24"/>
+          <w:szCs w:val="24"/>
+        </w:rPr>
+        <w:t xml:space="preserve"> [17]</w:t>
+      </w:r>
+      <w:r>
+        <w:rPr>
+          <w:rFonts w:ascii="Times New Roman" w:eastAsia="Times New Roman" w:hAnsi="Times New Roman" w:cs="Times New Roman"/>
+          <w:sz w:val="24"/>
+          <w:szCs w:val="24"/>
+        </w:rPr>
+        <w:t>.</w:t>
       </w:r>
     </w:p>
     <w:p>
@@ -16828,7 +16964,23 @@
           <w:sz w:val="24"/>
           <w:szCs w:val="24"/>
         </w:rPr>
-        <w:t>MySQL es un sistema gestor de bases de datos relacional de código abierto, ampliamente utilizado en aplicaciones web de todo tipo. La versión 8.0 Community Edition, empleada en este proyecto, es gratuita y no presenta limitaciones funcionales relevantes para el ámbito de este desarrollo.</w:t>
+        <w:t>MySQL es un sistema gestor de bases de datos relacional de código abierto, ampliamente utilizado en aplicaciones web de todo tipo. La versión 8.0 Community Edition, empleada en este proyecto, es gratuita y no presenta limitaciones funcionales relevantes para el ámbito de este desarrollo</w:t>
+      </w:r>
+      <w:r>
+        <w:rPr>
+          <w:rFonts w:ascii="Times New Roman" w:eastAsia="Times New Roman" w:hAnsi="Times New Roman" w:cs="Times New Roman"/>
+          <w:sz w:val="24"/>
+          <w:szCs w:val="24"/>
+        </w:rPr>
+        <w:t xml:space="preserve"> [14]</w:t>
+      </w:r>
+      <w:r>
+        <w:rPr>
+          <w:rFonts w:ascii="Times New Roman" w:eastAsia="Times New Roman" w:hAnsi="Times New Roman" w:cs="Times New Roman"/>
+          <w:sz w:val="24"/>
+          <w:szCs w:val="24"/>
+        </w:rPr>
+        <w:t>.</w:t>
       </w:r>
     </w:p>
     <w:p>
@@ -17128,7 +17280,23 @@
           <w:sz w:val="24"/>
           <w:szCs w:val="24"/>
         </w:rPr>
-        <w:t xml:space="preserve">Spring Security es el módulo estándar del ecosistema Spring para la gestión de la seguridad en aplicaciones Java. Proporciona un sistema de filtros HTTP que intercepta todas las peticiones entrantes y verifica si el usuario está autenticado y si dispone de los permisos necesarios para acceder al recurso solicitado. En </w:t>
+        <w:t>Spring Security es el módulo estándar del ecosistema Spring para la gestión de la seguridad en aplicaciones Java</w:t>
+      </w:r>
+      <w:r>
+        <w:rPr>
+          <w:rFonts w:ascii="Times New Roman" w:eastAsia="Times New Roman" w:hAnsi="Times New Roman" w:cs="Times New Roman"/>
+          <w:sz w:val="24"/>
+          <w:szCs w:val="24"/>
+        </w:rPr>
+        <w:t xml:space="preserve"> [9]</w:t>
+      </w:r>
+      <w:r>
+        <w:rPr>
+          <w:rFonts w:ascii="Times New Roman" w:eastAsia="Times New Roman" w:hAnsi="Times New Roman" w:cs="Times New Roman"/>
+          <w:sz w:val="24"/>
+          <w:szCs w:val="24"/>
+        </w:rPr>
+        <w:t xml:space="preserve">. Proporciona un sistema de filtros HTTP que intercepta todas las peticiones entrantes y verifica si el usuario está autenticado y si dispone de los permisos necesarios para acceder al recurso solicitado. En </w:t>
       </w:r>
       <w:r>
         <w:rPr>
@@ -17186,7 +17354,23 @@
           <w:sz w:val="24"/>
           <w:szCs w:val="24"/>
         </w:rPr>
-        <w:t xml:space="preserve">JWT (JSON Web Token) es un estándar abierto (RFC 7519) que define un formato compacto y autocontenido para transmitir información entre partes de forma segura mediante un objeto JSON firmado digitalmente. En el contexto de </w:t>
+        <w:t>JWT (JSON Web Token) es un estándar abierto (RFC 7519) que define un formato compacto y autocontenido para transmitir información entre partes de forma segura mediante un objeto JSON firmado digitalmente</w:t>
+      </w:r>
+      <w:r>
+        <w:rPr>
+          <w:rFonts w:ascii="Times New Roman" w:eastAsia="Times New Roman" w:hAnsi="Times New Roman" w:cs="Times New Roman"/>
+          <w:sz w:val="24"/>
+          <w:szCs w:val="24"/>
+        </w:rPr>
+        <w:t xml:space="preserve"> [15]</w:t>
+      </w:r>
+      <w:r>
+        <w:rPr>
+          <w:rFonts w:ascii="Times New Roman" w:eastAsia="Times New Roman" w:hAnsi="Times New Roman" w:cs="Times New Roman"/>
+          <w:sz w:val="24"/>
+          <w:szCs w:val="24"/>
+        </w:rPr>
+        <w:t xml:space="preserve">. En el contexto de </w:t>
       </w:r>
       <w:r>
         <w:rPr>
@@ -17244,7 +17428,23 @@
           <w:sz w:val="24"/>
           <w:szCs w:val="24"/>
         </w:rPr>
-        <w:t>BCrypt es un algoritmo de hash unidireccional diseñado específicamente para el almacenamiento seguro de contraseñas. A diferencia del cifrado reversible, un hash BCrypt no puede ser descifrado: solo puede verificarse comparando la contraseña introducida por el usuario con el hash almacenado. BCrypt incorpora automáticamente un salt aleatorio en cada hash generado, lo que garantiza que dos usuarios con la misma contraseña tengan hashes distintos en la base de datos. Es el algoritmo recomendado por OWASP para el almacenamiento de contraseñas y está integrado de forma nativa en Spring Security.</w:t>
+        <w:t>BCrypt es un algoritmo de hash unidireccional diseñado específicamente para el almacenamiento seguro de contraseñas</w:t>
+      </w:r>
+      <w:r>
+        <w:rPr>
+          <w:rFonts w:ascii="Times New Roman" w:eastAsia="Times New Roman" w:hAnsi="Times New Roman" w:cs="Times New Roman"/>
+          <w:sz w:val="24"/>
+          <w:szCs w:val="24"/>
+        </w:rPr>
+        <w:t xml:space="preserve"> [16]</w:t>
+      </w:r>
+      <w:r>
+        <w:rPr>
+          <w:rFonts w:ascii="Times New Roman" w:eastAsia="Times New Roman" w:hAnsi="Times New Roman" w:cs="Times New Roman"/>
+          <w:sz w:val="24"/>
+          <w:szCs w:val="24"/>
+        </w:rPr>
+        <w:t>. A diferencia del cifrado reversible, un hash BCrypt no puede ser descifrado: solo puede verificarse comparando la contraseña introducida por el usuario con el hash almacenado. BCrypt incorpora automáticamente un salt aleatorio en cada hash generado, lo que garantiza que dos usuarios con la misma contraseña tengan hashes distintos en la base de datos. Es el algoritmo recomendado por OWASP para el almacenamiento de contraseñas y está integrado de forma nativa en Spring Security.</w:t>
       </w:r>
     </w:p>
     <w:p>
@@ -17345,7 +17545,7 @@
           <w:sz w:val="24"/>
           <w:szCs w:val="24"/>
         </w:rPr>
-        <w:t xml:space="preserve">WebSockets es un protocolo de comunicación bidireccional y persistente sobre TCP, estandarizado en la RFC 6455. A diferencia del modelo de comunicación HTTP tradicional, en el que el cliente debe iniciar cada intercambio de información mediante una petición al servidor, WebSockets establece un canal de comunicación permanente entre cliente y </w:t>
+        <w:t xml:space="preserve">WebSockets es un protocolo de comunicación bidireccional y persistente sobre TCP, estandarizado en la RFC 6455. A diferencia del modelo de comunicación HTTP tradicional, en el que el cliente debe iniciar cada intercambio de información mediante una petición al </w:t>
       </w:r>
       <w:r>
         <w:rPr>
@@ -17354,7 +17554,7 @@
           <w:szCs w:val="24"/>
         </w:rPr>
         <w:lastRenderedPageBreak/>
-        <w:t>servidor que permite al servidor enviar datos al cliente en cualquier momento sin necesidad de que este los solicite previamente.</w:t>
+        <w:t>servidor, WebSockets establece un canal de comunicación permanente entre cliente y servidor que permite al servidor enviar datos al cliente en cualquier momento sin necesidad de que este los solicite previamente.</w:t>
       </w:r>
     </w:p>
     <w:p>
@@ -17695,7 +17895,23 @@
           <w:sz w:val="24"/>
           <w:szCs w:val="24"/>
         </w:rPr>
-        <w:t>React es una biblioteca de JavaScript para la construcción de interfaces de usuario, desarrollada y mantenida por Meta. Su modelo de programación se basa en componentes reutilizables: cada parte de la interfaz se encapsula en un componente con su propio estado y lógica, lo que favorece la modularidad y el mantenimiento del código. La versión 18, utilizada en este proyecto, introduce mejoras en el rendimiento mediante el renderizado concurrente y una gestión más eficiente de las actualizaciones de estado.</w:t>
+        <w:t>React es una biblioteca de JavaScript para la construcción de interfaces de usuario, desarrollada y mantenida por Meta</w:t>
+      </w:r>
+      <w:r>
+        <w:rPr>
+          <w:rFonts w:ascii="Times New Roman" w:eastAsia="Times New Roman" w:hAnsi="Times New Roman" w:cs="Times New Roman"/>
+          <w:sz w:val="24"/>
+          <w:szCs w:val="24"/>
+        </w:rPr>
+        <w:t xml:space="preserve"> [10]</w:t>
+      </w:r>
+      <w:r>
+        <w:rPr>
+          <w:rFonts w:ascii="Times New Roman" w:eastAsia="Times New Roman" w:hAnsi="Times New Roman" w:cs="Times New Roman"/>
+          <w:sz w:val="24"/>
+          <w:szCs w:val="24"/>
+        </w:rPr>
+        <w:t>. Su modelo de programación se basa en componentes reutilizables: cada parte de la interfaz se encapsula en un componente con su propio estado y lógica, lo que favorece la modularidad y el mantenimiento del código. La versión 18, utilizada en este proyecto, introduce mejoras en el rendimiento mediante el renderizado concurrente y una gestión más eficiente de las actualizaciones de estado.</w:t>
       </w:r>
     </w:p>
     <w:p>
@@ -17779,7 +17995,6 @@
           <w:sz w:val="24"/>
           <w:szCs w:val="24"/>
         </w:rPr>
-        <w:lastRenderedPageBreak/>
         <w:t xml:space="preserve">En </w:t>
       </w:r>
       <w:r>
@@ -17897,7 +18112,23 @@
           <w:sz w:val="24"/>
           <w:szCs w:val="24"/>
         </w:rPr>
-        <w:t>Tailwind CSS es un framework de estilos CSS basado en el enfoque utility-first, en el que los estilos se aplican directamente en el HTML mediante clases de utilidad predefinidas en lugar de escribir hojas de estilo personalizadas. Esto permite construir interfaces visuales complejas y consistentes sin necesidad de abandonar el archivo de plantilla.</w:t>
+        <w:t>Tailwind CSS es un framework de estilos CSS basado en el enfoque utility-first, en el que los estilos se aplican directamente en el HTML mediante clases de utilidad predefinidas en lugar de escribir hojas de estilo personalizadas</w:t>
+      </w:r>
+      <w:r>
+        <w:rPr>
+          <w:rFonts w:ascii="Times New Roman" w:eastAsia="Times New Roman" w:hAnsi="Times New Roman" w:cs="Times New Roman"/>
+          <w:sz w:val="24"/>
+          <w:szCs w:val="24"/>
+        </w:rPr>
+        <w:t xml:space="preserve"> [11]</w:t>
+      </w:r>
+      <w:r>
+        <w:rPr>
+          <w:rFonts w:ascii="Times New Roman" w:eastAsia="Times New Roman" w:hAnsi="Times New Roman" w:cs="Times New Roman"/>
+          <w:sz w:val="24"/>
+          <w:szCs w:val="24"/>
+        </w:rPr>
+        <w:t>. Esto permite construir interfaces visuales complejas y consistentes sin necesidad de abandonar el archivo de plantilla.</w:t>
       </w:r>
     </w:p>
     <w:p>
@@ -18056,8 +18287,41 @@
           <w:sz w:val="24"/>
           <w:szCs w:val="24"/>
         </w:rPr>
-        <w:t>Vite es una herramienta de construcción y desarrollo para aplicaciones web modernas que destaca por su velocidad. A diferencia de herramientas anteriores como Webpack o Create React App, Vite aprovecha los módulos ES nativos del navegador para servir el código fuente durante el desarrollo sin necesidad de empaquetarlo previamente, lo que reduce el tiempo de arranque del servidor de desarrollo a menos de un segundo independientemente del tamaño del proyecto.</w:t>
-      </w:r>
+        <w:t>Vite es una herramienta de construcción y desarrollo para aplicaciones web modernas que destaca por su velocidad</w:t>
+      </w:r>
+      <w:r>
+        <w:rPr>
+          <w:rFonts w:ascii="Times New Roman" w:eastAsia="Times New Roman" w:hAnsi="Times New Roman" w:cs="Times New Roman"/>
+          <w:sz w:val="24"/>
+          <w:szCs w:val="24"/>
+        </w:rPr>
+        <w:t xml:space="preserve"> [12]</w:t>
+      </w:r>
+      <w:r>
+        <w:rPr>
+          <w:rFonts w:ascii="Times New Roman" w:eastAsia="Times New Roman" w:hAnsi="Times New Roman" w:cs="Times New Roman"/>
+          <w:sz w:val="24"/>
+          <w:szCs w:val="24"/>
+        </w:rPr>
+        <w:t>. A diferencia de herramientas anteriores como Webpack o Create React App, Vite aprovecha los módulos ES nativos del navegador para servir el código fuente durante el desarrollo sin necesidad de empaquetarlo previamente, lo que reduce el tiempo de arranque del servidor de desarrollo a menos de un segundo independientemente del tamaño del proyecto.</w:t>
+      </w:r>
+    </w:p>
+    <w:p>
+      <w:pPr>
+        <w:pBdr>
+          <w:top w:val="nil"/>
+          <w:left w:val="nil"/>
+          <w:bottom w:val="nil"/>
+          <w:right w:val="nil"/>
+          <w:between w:val="nil"/>
+        </w:pBdr>
+        <w:jc w:val="both"/>
+        <w:rPr>
+          <w:rFonts w:ascii="Times New Roman" w:eastAsia="Times New Roman" w:hAnsi="Times New Roman" w:cs="Times New Roman"/>
+          <w:sz w:val="24"/>
+          <w:szCs w:val="24"/>
+        </w:rPr>
+      </w:pPr>
     </w:p>
     <w:p>
       <w:pPr>
@@ -18097,7 +18361,7 @@
           <w:sz w:val="24"/>
           <w:szCs w:val="24"/>
         </w:rPr>
-        <w:t xml:space="preserve">, Vite gestiona el servidor de desarrollo con recarga en caliente (HMR) y genera el bundle optimizado para producción que se despliega en Vercel. Adicionalmente, durante el desarrollo se utiliza la funcionalidad de proxy integrada en Vite, que permite redirigir las peticiones del frontend al backend de forma transparente sin necesidad de configurar CORS manualmente en el entorno local. Esta configuración se define en el archivo vite.config.js y evita los errores de política de mismo </w:t>
+        <w:t xml:space="preserve">, Vite gestiona el servidor de desarrollo con recarga en caliente (HMR) y genera el bundle optimizado para producción que se despliega en Vercel. Adicionalmente, durante el desarrollo se utiliza la funcionalidad de proxy integrada en Vite, que permite redirigir las peticiones del frontend al backend de forma transparente sin necesidad de configurar CORS manualmente en el entorno local. Esta </w:t>
       </w:r>
       <w:r>
         <w:rPr>
@@ -18106,7 +18370,7 @@
           <w:szCs w:val="24"/>
         </w:rPr>
         <w:lastRenderedPageBreak/>
-        <w:t>origen que surgirían al acceder directamente desde el frontend al backend cuando ambos se ejecutan en puertos distintos durante el desarrollo.</w:t>
+        <w:t>configuración se define en el archivo vite.config.js y evita los errores de política de mismo origen que surgirían al acceder directamente desde el frontend al backend cuando ambos se ejecutan en puertos distintos durante el desarrollo.</w:t>
       </w:r>
     </w:p>
     <w:p>
@@ -18207,7 +18471,23 @@
           <w:sz w:val="24"/>
           <w:szCs w:val="24"/>
         </w:rPr>
-        <w:t>Axios es una librería JavaScript para la realización de peticiones HTTP desde el navegador y desde Node.js. Proporciona una interfaz basada en promesas que simplifica el manejo de peticiones asíncronas y ofrece funcionalidades adicionales respecto a la API Fetch nativa del navegador, como la transformación automática de respuestas JSON, la gestión centralizada de errores mediante interceptores y la posibilidad de configurar cabeceras globales para todas las peticiones.</w:t>
+        <w:t>Axios es una librería JavaScript para la realización de peticiones HTTP desde el navegador y desde Node.js</w:t>
+      </w:r>
+      <w:r>
+        <w:rPr>
+          <w:rFonts w:ascii="Times New Roman" w:eastAsia="Times New Roman" w:hAnsi="Times New Roman" w:cs="Times New Roman"/>
+          <w:sz w:val="24"/>
+          <w:szCs w:val="24"/>
+        </w:rPr>
+        <w:t xml:space="preserve"> [13]</w:t>
+      </w:r>
+      <w:r>
+        <w:rPr>
+          <w:rFonts w:ascii="Times New Roman" w:eastAsia="Times New Roman" w:hAnsi="Times New Roman" w:cs="Times New Roman"/>
+          <w:sz w:val="24"/>
+          <w:szCs w:val="24"/>
+        </w:rPr>
+        <w:t>. Proporciona una interfaz basada en promesas que simplifica el manejo de peticiones asíncronas y ofrece funcionalidades adicionales respecto a la API Fetch nativa del navegador, como la transformación automática de respuestas JSON, la gestión centralizada de errores mediante interceptores y la posibilidad de configurar cabeceras globales para todas las peticiones.</w:t>
       </w:r>
     </w:p>
     <w:p>
@@ -18565,6 +18845,7 @@
           <w:sz w:val="28"/>
           <w:szCs w:val="28"/>
         </w:rPr>
+        <w:lastRenderedPageBreak/>
         <w:t>3.4.2.- Git y GitHub</w:t>
       </w:r>
     </w:p>
@@ -19032,7 +19313,6 @@
           <w:sz w:val="24"/>
           <w:szCs w:val="24"/>
         </w:rPr>
-        <w:lastRenderedPageBreak/>
         <w:t xml:space="preserve">El despliegue de </w:t>
       </w:r>
       <w:r>
@@ -19150,7 +19430,23 @@
           <w:sz w:val="24"/>
           <w:szCs w:val="24"/>
         </w:rPr>
-        <w:t>Vercel es una plataforma de despliegue especializada en aplicaciones frontend y sitios web estáticos. Ofrece integración nativa con GitHub: cuando se realiza un push a la rama configurada del repositorio, Vercel detecta el cambio automáticamente, construye la aplicación ejecutando el comando de build de Vite y despliega el resultado en su red de distribución de contenidos (CDN) global. Esto garantiza tiempos de carga bajos independientemente de la ubicación geográfica del usuario.</w:t>
+        <w:t>Vercel es una plataforma de despliegue especializada en aplicaciones frontend y sitios web estáticos</w:t>
+      </w:r>
+      <w:r>
+        <w:rPr>
+          <w:rFonts w:ascii="Times New Roman" w:eastAsia="Times New Roman" w:hAnsi="Times New Roman" w:cs="Times New Roman"/>
+          <w:sz w:val="24"/>
+          <w:szCs w:val="24"/>
+        </w:rPr>
+        <w:t xml:space="preserve"> [18]</w:t>
+      </w:r>
+      <w:r>
+        <w:rPr>
+          <w:rFonts w:ascii="Times New Roman" w:eastAsia="Times New Roman" w:hAnsi="Times New Roman" w:cs="Times New Roman"/>
+          <w:sz w:val="24"/>
+          <w:szCs w:val="24"/>
+        </w:rPr>
+        <w:t>. Ofrece integración nativa con GitHub: cuando se realiza un push a la rama configurada del repositorio, Vercel detecta el cambio automáticamente, construye la aplicación ejecutando el comando de build de Vite y despliega el resultado en su red de distribución de contenidos (CDN) global. Esto garantiza tiempos de carga bajos independientemente de la ubicación geográfica del usuario.</w:t>
       </w:r>
     </w:p>
     <w:p>
@@ -19293,7 +19589,23 @@
           <w:sz w:val="24"/>
           <w:szCs w:val="24"/>
         </w:rPr>
-        <w:t>Railway es una plataforma de despliegue en la nube orientada a aplicaciones backend y bases de datos. Permite desplegar aplicaciones Spring Boot empaquetadas como archivos JAR y aprovisionar instancias de MySQL gestionadas, ambas en el mismo entorno y con comunicación interna directa. Railway ofrece un plan gratuito con cinco dólares de crédito mensual, suficiente para mantener activas las instancias del backend y la base de datos durante el desarrollo y la evaluación del proyecto.</w:t>
+        <w:t>Railway es una plataforma de despliegue en la nube orientada a aplicaciones backend y bases de datos</w:t>
+      </w:r>
+      <w:r>
+        <w:rPr>
+          <w:rFonts w:ascii="Times New Roman" w:eastAsia="Times New Roman" w:hAnsi="Times New Roman" w:cs="Times New Roman"/>
+          <w:sz w:val="24"/>
+          <w:szCs w:val="24"/>
+        </w:rPr>
+        <w:t xml:space="preserve"> [19]</w:t>
+      </w:r>
+      <w:r>
+        <w:rPr>
+          <w:rFonts w:ascii="Times New Roman" w:eastAsia="Times New Roman" w:hAnsi="Times New Roman" w:cs="Times New Roman"/>
+          <w:sz w:val="24"/>
+          <w:szCs w:val="24"/>
+        </w:rPr>
+        <w:t>. Permite desplegar aplicaciones Spring Boot empaquetadas como archivos JAR y aprovisionar instancias de MySQL gestionadas, ambas en el mismo entorno y con comunicación interna directa. Railway ofrece un plan gratuito con cinco dólares de crédito mensual, suficiente para mantener activas las instancias del backend y la base de datos durante el desarrollo y la evaluación del proyecto.</w:t>
       </w:r>
     </w:p>
     <w:p>
@@ -20330,7 +20642,23 @@
           <w:sz w:val="24"/>
           <w:szCs w:val="24"/>
         </w:rPr>
-        <w:t>Un actor representa cualquier entidad externa que interactúa con el sistema. En CarePet se han identificado cinco actores, cuyas características se recogen en la siguiente tabla:</w:t>
+        <w:t>Un actor representa cualquier entidad externa que interactúa con el sistema</w:t>
+      </w:r>
+      <w:r>
+        <w:rPr>
+          <w:rFonts w:ascii="Times New Roman" w:eastAsia="Times New Roman" w:hAnsi="Times New Roman" w:cs="Times New Roman"/>
+          <w:sz w:val="24"/>
+          <w:szCs w:val="24"/>
+        </w:rPr>
+        <w:t xml:space="preserve"> [20]</w:t>
+      </w:r>
+      <w:r>
+        <w:rPr>
+          <w:rFonts w:ascii="Times New Roman" w:eastAsia="Times New Roman" w:hAnsi="Times New Roman" w:cs="Times New Roman"/>
+          <w:sz w:val="24"/>
+          <w:szCs w:val="24"/>
+        </w:rPr>
+        <w:t>. En CarePet se han identificado cinco actores, cuyas características se recogen en la siguiente tabla:</w:t>
       </w:r>
     </w:p>
     <w:p>
@@ -20799,7 +21127,23 @@
           <w:sz w:val="24"/>
           <w:szCs w:val="24"/>
         </w:rPr>
-        <w:t>Los requisitos funcionales describen las capacidades que el sistema debe proporcionar a sus usuarios. Se han identificado 73 requisitos funcionales, organizados en nueve áreas funcionales. Cada requisito se clasifica según su prioridad: Alta, Media o Baja.</w:t>
+        <w:t>Los requisitos funcionales describen las capacidades que el sistema debe proporcionar a sus usuarios</w:t>
+      </w:r>
+      <w:r>
+        <w:rPr>
+          <w:rFonts w:ascii="Times New Roman" w:eastAsia="Times New Roman" w:hAnsi="Times New Roman" w:cs="Times New Roman"/>
+          <w:sz w:val="24"/>
+          <w:szCs w:val="24"/>
+        </w:rPr>
+        <w:t xml:space="preserve"> [20]</w:t>
+      </w:r>
+      <w:r>
+        <w:rPr>
+          <w:rFonts w:ascii="Times New Roman" w:eastAsia="Times New Roman" w:hAnsi="Times New Roman" w:cs="Times New Roman"/>
+          <w:sz w:val="24"/>
+          <w:szCs w:val="24"/>
+        </w:rPr>
+        <w:t>. Se han identificado 73 requisitos funcionales, organizados en nueve áreas funcionales. Cada requisito se clasifica según su prioridad: Alta, Media o Baja.</w:t>
       </w:r>
     </w:p>
     <w:p>
@@ -27925,7 +28269,23 @@
           <w:sz w:val="24"/>
           <w:szCs w:val="24"/>
         </w:rPr>
-        <w:t>Los requisitos no funcionales establecen las restricciones y atributos de calidad del sistema que no están directamente relacionados con las funcionalidades concretas, sino con cómo debe comportarse el sistema en su conjunto.</w:t>
+        <w:t>Los requisitos no funcionales establecen las restricciones y atributos de calidad del sistema que no están directamente relacionados con las funcionalidades concretas, sino con cómo debe comportarse el sistema en su conjunto</w:t>
+      </w:r>
+      <w:r>
+        <w:rPr>
+          <w:rFonts w:ascii="Times New Roman" w:eastAsia="Times New Roman" w:hAnsi="Times New Roman" w:cs="Times New Roman"/>
+          <w:sz w:val="24"/>
+          <w:szCs w:val="24"/>
+        </w:rPr>
+        <w:t xml:space="preserve"> [20]</w:t>
+      </w:r>
+      <w:r>
+        <w:rPr>
+          <w:rFonts w:ascii="Times New Roman" w:eastAsia="Times New Roman" w:hAnsi="Times New Roman" w:cs="Times New Roman"/>
+          <w:sz w:val="24"/>
+          <w:szCs w:val="24"/>
+        </w:rPr>
+        <w:t>.</w:t>
       </w:r>
     </w:p>
     <w:p>
@@ -28722,7 +29082,23 @@
           <w:sz w:val="24"/>
           <w:szCs w:val="24"/>
         </w:rPr>
-        <w:t>A continuación, se describen los casos de uso más representativos del sistema. Para los casos de uso de menor complejidad se incluye únicamente una descripción resumida, mientras que los casos de uso centrales del proyecto se desarrollan con la plantilla completa.</w:t>
+        <w:t>A continuación, se describen los casos de uso más representativos del sistema</w:t>
+      </w:r>
+      <w:r>
+        <w:rPr>
+          <w:rFonts w:ascii="Times New Roman" w:eastAsia="Times New Roman" w:hAnsi="Times New Roman" w:cs="Times New Roman"/>
+          <w:sz w:val="24"/>
+          <w:szCs w:val="24"/>
+        </w:rPr>
+        <w:t xml:space="preserve"> [20]</w:t>
+      </w:r>
+      <w:r>
+        <w:rPr>
+          <w:rFonts w:ascii="Times New Roman" w:eastAsia="Times New Roman" w:hAnsi="Times New Roman" w:cs="Times New Roman"/>
+          <w:sz w:val="24"/>
+          <w:szCs w:val="24"/>
+        </w:rPr>
+        <w:t>. Para los casos de uso de menor complejidad se incluye únicamente una descripción resumida, mientras que los casos de uso centrales del proyecto se desarrollan con la plantilla completa.</w:t>
       </w:r>
     </w:p>
     <w:p>
@@ -32371,7 +32747,23 @@
           <w:sz w:val="24"/>
           <w:szCs w:val="24"/>
         </w:rPr>
-        <w:t>de los flujos más relevantes del sistema.</w:t>
+        <w:t>de los flujos más relevantes del sistema</w:t>
+      </w:r>
+      <w:r>
+        <w:rPr>
+          <w:rFonts w:ascii="Times New Roman" w:eastAsia="Times New Roman" w:hAnsi="Times New Roman" w:cs="Times New Roman"/>
+          <w:sz w:val="24"/>
+          <w:szCs w:val="24"/>
+        </w:rPr>
+        <w:t xml:space="preserve"> [20]</w:t>
+      </w:r>
+      <w:r>
+        <w:rPr>
+          <w:rFonts w:ascii="Times New Roman" w:eastAsia="Times New Roman" w:hAnsi="Times New Roman" w:cs="Times New Roman"/>
+          <w:sz w:val="24"/>
+          <w:szCs w:val="24"/>
+        </w:rPr>
+        <w:t>.</w:t>
       </w:r>
     </w:p>
     <w:p>
@@ -33575,7 +33967,23 @@
           <w:sz w:val="24"/>
           <w:szCs w:val="24"/>
         </w:rPr>
-        <w:t>A continuación, se presentan los diagramas de secuencia de los dos flujos más relevantes del sistema.</w:t>
+        <w:t>A continuación, se presentan los diagramas de secuencia de los dos flujos más relevantes del sistema</w:t>
+      </w:r>
+      <w:r>
+        <w:rPr>
+          <w:rFonts w:ascii="Times New Roman" w:eastAsia="Times New Roman" w:hAnsi="Times New Roman" w:cs="Times New Roman"/>
+          <w:sz w:val="24"/>
+          <w:szCs w:val="24"/>
+        </w:rPr>
+        <w:t xml:space="preserve"> [20]</w:t>
+      </w:r>
+      <w:r>
+        <w:rPr>
+          <w:rFonts w:ascii="Times New Roman" w:eastAsia="Times New Roman" w:hAnsi="Times New Roman" w:cs="Times New Roman"/>
+          <w:sz w:val="24"/>
+          <w:szCs w:val="24"/>
+        </w:rPr>
+        <w:t>.</w:t>
       </w:r>
     </w:p>
     <w:p>
@@ -34083,7 +34491,23 @@
           <w:sz w:val="24"/>
           <w:szCs w:val="24"/>
         </w:rPr>
-        <w:t>Los diagramas de estados describen el ciclo de vida de aquellos objetos del sistema cuyo comportamiento varía en función del estado en que se encuentran. En CarePet se han identificado dos entidades con un ciclo de vida suficientemente relevante para ser documentado mediante este tipo de diagrama: la medicación y la invitación al hogar.</w:t>
+        <w:t>Los diagramas de estados describen el ciclo de vida de aquellos objetos del sistema cuyo comportamiento varía en función del estado en que se encuentran</w:t>
+      </w:r>
+      <w:r>
+        <w:rPr>
+          <w:rFonts w:ascii="Times New Roman" w:eastAsia="Times New Roman" w:hAnsi="Times New Roman" w:cs="Times New Roman"/>
+          <w:sz w:val="24"/>
+          <w:szCs w:val="24"/>
+        </w:rPr>
+        <w:t xml:space="preserve"> [20]</w:t>
+      </w:r>
+      <w:r>
+        <w:rPr>
+          <w:rFonts w:ascii="Times New Roman" w:eastAsia="Times New Roman" w:hAnsi="Times New Roman" w:cs="Times New Roman"/>
+          <w:sz w:val="24"/>
+          <w:szCs w:val="24"/>
+        </w:rPr>
+        <w:t>. En CarePet se han identificado dos entidades con un ciclo de vida suficientemente relevante para ser documentado mediante este tipo de diagrama: la medicación y la invitación al hogar.</w:t>
       </w:r>
     </w:p>
     <w:p>
@@ -34458,7 +34882,23 @@
           <w:sz w:val="24"/>
           <w:szCs w:val="24"/>
         </w:rPr>
-        <w:t>El diagrama de actividad describe el flujo de control del algoritmo más complejo de CarePet: el registro de una toma de medicamento con validación anti-duplicados, que constituye la funcionalidad central del proyecto.</w:t>
+        <w:t>El diagrama de actividad describe el flujo de control del algoritmo más complejo de CarePet: el registro de una toma de medicamento con validación anti-duplicados, que constituye la funcionalidad central del proyecto</w:t>
+      </w:r>
+      <w:r>
+        <w:rPr>
+          <w:rFonts w:ascii="Times New Roman" w:eastAsia="Times New Roman" w:hAnsi="Times New Roman" w:cs="Times New Roman"/>
+          <w:sz w:val="24"/>
+          <w:szCs w:val="24"/>
+        </w:rPr>
+        <w:t xml:space="preserve"> [20]</w:t>
+      </w:r>
+      <w:r>
+        <w:rPr>
+          <w:rFonts w:ascii="Times New Roman" w:eastAsia="Times New Roman" w:hAnsi="Times New Roman" w:cs="Times New Roman"/>
+          <w:sz w:val="24"/>
+          <w:szCs w:val="24"/>
+        </w:rPr>
+        <w:t>.</w:t>
       </w:r>
     </w:p>
     <w:p>
@@ -35142,14 +35582,7 @@
       <w:r>
         <w:t>9</w:t>
       </w:r>
-      <w:fldSimple w:instr=" SEQ Ilustración \* ARABIC ">
-        <w:r>
-          <w:rPr>
-            <w:noProof/>
-          </w:rPr>
-          <w:t>10</w:t>
-        </w:r>
-      </w:fldSimple>
+      <w:fldSimple w:instr=" SEQ Ilustración \* ARABIC "/>
       <w:r>
         <w:t>: CarePet pantalla registro</w:t>
       </w:r>
@@ -35527,14 +35960,6 @@
       <w:r>
         <w:t>11</w:t>
       </w:r>
-      <w:fldSimple w:instr=" SEQ Ilustración \* ARABIC ">
-        <w:r>
-          <w:rPr>
-            <w:noProof/>
-          </w:rPr>
-          <w:t>11</w:t>
-        </w:r>
-      </w:fldSimple>
       <w:r>
         <w:t>: CarePet pantalla hogares</w:t>
       </w:r>
@@ -35718,14 +36143,6 @@
       <w:r>
         <w:t>13</w:t>
       </w:r>
-      <w:fldSimple w:instr=" SEQ Ilustración \* ARABIC ">
-        <w:r>
-          <w:rPr>
-            <w:noProof/>
-          </w:rPr>
-          <w:t>12</w:t>
-        </w:r>
-      </w:fldSimple>
       <w:r>
         <w:t>: CarePet modal de invitación de un miembro al hogar</w:t>
       </w:r>
@@ -35910,14 +36327,6 @@
       <w:r>
         <w:t>14</w:t>
       </w:r>
-      <w:fldSimple w:instr=" SEQ Ilustración \* ARABIC ">
-        <w:r>
-          <w:rPr>
-            <w:noProof/>
-          </w:rPr>
-          <w:t>13</w:t>
-        </w:r>
-      </w:fldSimple>
       <w:r>
         <w:t>: CarePet pantalla mascotas</w:t>
       </w:r>
@@ -36244,14 +36653,6 @@
       <w:r>
         <w:t>18</w:t>
       </w:r>
-      <w:fldSimple w:instr=" SEQ Ilustración \* ARABIC ">
-        <w:r>
-          <w:rPr>
-            <w:noProof/>
-          </w:rPr>
-          <w:t>14</w:t>
-        </w:r>
-      </w:fldSimple>
       <w:r>
         <w:t>: CarePet formulario creación mascota</w:t>
       </w:r>
@@ -36440,14 +36841,6 @@
       <w:r>
         <w:t>19</w:t>
       </w:r>
-      <w:fldSimple w:instr=" SEQ Ilustración \* ARABIC ">
-        <w:r>
-          <w:rPr>
-            <w:noProof/>
-          </w:rPr>
-          <w:t>15</w:t>
-        </w:r>
-      </w:fldSimple>
       <w:r>
         <w:t>: CarePet pantalla medicación</w:t>
       </w:r>
@@ -36532,14 +36925,7 @@
       <w:r>
         <w:t>20</w:t>
       </w:r>
-      <w:fldSimple w:instr=" SEQ Ilustración \* ARABIC ">
-        <w:r>
-          <w:rPr>
-            <w:noProof/>
-          </w:rPr>
-          <w:t>16</w:t>
-        </w:r>
-      </w:fldSimple>
+      <w:fldSimple w:instr=" SEQ Ilustración \* ARABIC "/>
       <w:r>
         <w:t>: CarePet pantalla detalle medicación</w:t>
       </w:r>
@@ -37075,14 +37461,7 @@
       <w:r>
         <w:t>24</w:t>
       </w:r>
-      <w:fldSimple w:instr=" SEQ Ilustración \* ARABIC ">
-        <w:r>
-          <w:rPr>
-            <w:noProof/>
-          </w:rPr>
-          <w:t>17</w:t>
-        </w:r>
-      </w:fldSimple>
+      <w:fldSimple w:instr=" SEQ Ilustración \* ARABIC "/>
       <w:r>
         <w:t>: CarePet pantalla paseos</w:t>
       </w:r>

</xml_diff>